<commit_message>
Add Day_08 slides, assets and generator
Update Day 08 content: replace/modify Lab guide (.docx), add revamped presentation (Day_08_Slides_Revamped.pptx), and include a set of slide asset images (airflow/hop/kafka diagrams). Add generate_slides.py (script to programmatically recreate the Day 8 slide deck with consistent theme/layout) and inspect_theme.py. These additions provide the PPTX, source assets, and a generator to keep slide design reproducible.
</commit_message>
<xml_diff>
--- a/Week_02/Day_08/Lab/Day_08_Lab_Guide.docx
+++ b/Week_02/Day_08/Lab/Day_08_Lab_Guide.docx
@@ -4,10 +4,14 @@
   <w:body>
     <w:p>
       <w:pPr>
-        <w:pStyle w:val="Title"/>
         <w:jc w:val="center"/>
       </w:pPr>
       <w:r>
+        <w:rPr>
+          <w:b/>
+          <w:color w:val="1F4E79"/>
+          <w:sz w:val="48"/>
+        </w:rPr>
         <w:t>Day 08 Student Lab Guide</w:t>
       </w:r>
     </w:p>
@@ -17,12 +21,26 @@
       </w:pPr>
       <w:r>
         <w:rPr>
-          <w:b/>
-          <w:sz w:val="28"/>
+          <w:color w:val="232323"/>
+          <w:sz w:val="26"/>
         </w:rPr>
-        <w:t>Orchestration with Airflow: File-Triggered Medallion DAG</w:t>
+        <w:t>Workflow Orchestration with Apache Airflow, Kafka, Apache Hop and PostgreSQL</w:t>
       </w:r>
     </w:p>
+    <w:p>
+      <w:pPr>
+        <w:jc w:val="center"/>
+      </w:pPr>
+      <w:r>
+        <w:rPr>
+          <w:b/>
+          <w:color w:val="5B9BD5"/>
+          <w:sz w:val="22"/>
+        </w:rPr>
+        <w:t>Scope: Week_02/Day_08/Lab_Files only</w:t>
+      </w:r>
+    </w:p>
+    <w:p/>
     <w:p>
       <w:pPr>
         <w:pStyle w:val="Heading1"/>
@@ -33,32 +51,506 @@
     </w:p>
     <w:p>
       <w:r>
-        <w:t>Trigger, observe, and validate an Apache Airflow DAG that moves CSV order data through Bronze, Silver, and Gold Postgres tables.</w:t>
+        <w:t>By the end of Day 8, students will run a Docker Compose based orchestration lab, explore the Airflow UI, trigger ten progressive DAGs, and validate a medallion pipeline that combines CSV batch ingestion, Kafka events, Apache Hop pipeline assets, and PostgreSQL Bronze/Silver/Gold tables.</w:t>
+      </w:r>
+    </w:p>
+    <w:p>
+      <w:pPr>
+        <w:pStyle w:val="Heading1"/>
+      </w:pPr>
+      <w:r>
+        <w:t>Day 8 Package Notes</w:t>
+      </w:r>
+    </w:p>
+    <w:p>
+      <w:pPr>
+        <w:pStyle w:val="ListBullet"/>
+      </w:pPr>
+      <w:r>
+        <w:t>This guide matches the current Day 8 Lab_Files package.</w:t>
+      </w:r>
+    </w:p>
+    <w:p>
+      <w:pPr>
+        <w:pStyle w:val="ListBullet"/>
+      </w:pPr>
+      <w:r>
+        <w:t>The active medallion DAG ID is 03_medallion_pipeline, exposed by dags/medallion_pipeline.py.</w:t>
+      </w:r>
+    </w:p>
+    <w:p>
+      <w:pPr>
+        <w:pStyle w:val="ListBullet"/>
+      </w:pPr>
+      <w:r>
+        <w:t>The current package includes Airflow, PostgreSQL, Kafka, Kafka UI, Apache Hop Web, Hop pipeline files, helper utilities, setup verification, and ten lab DAGs.</w:t>
+      </w:r>
+    </w:p>
+    <w:p>
+      <w:pPr>
+        <w:pStyle w:val="ListBullet"/>
+      </w:pPr>
+      <w:r>
+        <w:t>This document contains Day 8 material only and does not require files from other course days.</w:t>
+      </w:r>
+    </w:p>
+    <w:p>
+      <w:pPr>
+        <w:pStyle w:val="Heading1"/>
+      </w:pPr>
+      <w:r>
+        <w:t>Prerequisites</w:t>
+      </w:r>
+    </w:p>
+    <w:p>
+      <w:pPr>
+        <w:pStyle w:val="ListBullet"/>
+      </w:pPr>
+      <w:r>
+        <w:t>Docker Desktop or Docker Engine with Docker Compose v2.</w:t>
+      </w:r>
+    </w:p>
+    <w:p>
+      <w:pPr>
+        <w:pStyle w:val="ListBullet"/>
+      </w:pPr>
+      <w:r>
+        <w:t>At least 8 GB RAM allocated to Docker for a comfortable classroom run.</w:t>
+      </w:r>
+    </w:p>
+    <w:p>
+      <w:pPr>
+        <w:pStyle w:val="ListBullet"/>
+      </w:pPr>
+      <w:r>
+        <w:t>A modern browser for Airflow, Kafka UI and Hop Web.</w:t>
+      </w:r>
+    </w:p>
+    <w:p>
+      <w:pPr>
+        <w:pStyle w:val="ListBullet"/>
+      </w:pPr>
+      <w:r>
+        <w:t>Run all commands from the Day 8 Lab_Files folder unless a command says otherwise.</w:t>
+      </w:r>
+    </w:p>
+    <w:p>
+      <w:pPr>
+        <w:pStyle w:val="Heading1"/>
+      </w:pPr>
+      <w:r>
+        <w:t>Lab Folder</w:t>
+      </w:r>
+    </w:p>
+    <w:p>
+      <w:r>
+        <w:t>From the repository root, use:</w:t>
+      </w:r>
+    </w:p>
+    <w:p>
+      <w:pPr>
+        <w:pStyle w:val="NoSpacing"/>
+        <w:spacing w:after="120"/>
+      </w:pPr>
+      <w:r>
+        <w:rPr>
+          <w:rFonts w:ascii="Courier New" w:hAnsi="Courier New" w:eastAsia="Courier New"/>
+          <w:color w:val="232323"/>
+          <w:sz w:val="17"/>
+        </w:rPr>
+        <w:t>cd Week_02\Day_08\Lab_Files</w:t>
+      </w:r>
+    </w:p>
+    <w:p>
+      <w:r>
+        <w:t>Core assets in this lab package:</w:t>
       </w:r>
     </w:p>
     <w:tbl>
       <w:tblPr>
+        <w:tblStyle w:val="TableGrid"/>
         <w:tblW w:type="auto" w:w="0"/>
+        <w:jc w:val="center"/>
         <w:tblLook w:firstColumn="1" w:firstRow="1" w:lastColumn="0" w:lastRow="0" w:noHBand="0" w:noVBand="1" w:val="04A0"/>
       </w:tblPr>
       <w:tblGrid>
-        <w:gridCol w:w="10368"/>
+        <w:gridCol w:w="5112"/>
+        <w:gridCol w:w="5112"/>
       </w:tblGrid>
       <w:tr>
         <w:tc>
           <w:tcPr>
-            <w:tcW w:type="dxa" w:w="10368"/>
-            <w:shd w:fill="EAF7EE"/>
+            <w:tcW w:type="dxa" w:w="5112"/>
+            <w:vAlign w:val="top"/>
+            <w:shd w:fill="1F4E79"/>
           </w:tcPr>
           <w:p>
+            <w:r/>
             <w:r>
               <w:rPr>
                 <w:b/>
+                <w:color w:val="FFFFFF"/>
+                <w:sz w:val="18"/>
               </w:rPr>
-              <w:t xml:space="preserve">Real screenshots: </w:t>
+              <w:t>Path</w:t>
             </w:r>
+          </w:p>
+        </w:tc>
+        <w:tc>
+          <w:tcPr>
+            <w:tcW w:type="dxa" w:w="5112"/>
+            <w:vAlign w:val="top"/>
+            <w:shd w:fill="1F4E79"/>
+          </w:tcPr>
+          <w:p>
+            <w:r/>
             <w:r>
-              <w:t>The screenshots in this document are real Ubuntu desktop captures from Firefox using gnome-screenshot, not generated mockups.</w:t>
+              <w:rPr>
+                <w:b/>
+                <w:color w:val="FFFFFF"/>
+                <w:sz w:val="18"/>
+              </w:rPr>
+              <w:t>Purpose</w:t>
+            </w:r>
+          </w:p>
+        </w:tc>
+      </w:tr>
+      <w:tr>
+        <w:tc>
+          <w:tcPr>
+            <w:tcW w:type="dxa" w:w="5112"/>
+            <w:vAlign w:val="top"/>
+          </w:tcPr>
+          <w:p>
+            <w:r/>
+            <w:r>
+              <w:rPr>
+                <w:b w:val="0"/>
+                <w:sz w:val="18"/>
+              </w:rPr>
+              <w:t>docker-compose.yml</w:t>
+            </w:r>
+          </w:p>
+        </w:tc>
+        <w:tc>
+          <w:tcPr>
+            <w:tcW w:type="dxa" w:w="5112"/>
+            <w:vAlign w:val="top"/>
+          </w:tcPr>
+          <w:p>
+            <w:r/>
+            <w:r>
+              <w:rPr>
+                <w:b w:val="0"/>
+                <w:sz w:val="18"/>
+              </w:rPr>
+              <w:t>Starts PostgreSQL, Kafka, Kafka UI, Airflow init, Airflow webserver, Airflow scheduler/triggerer, and Hop Web.</w:t>
+            </w:r>
+          </w:p>
+        </w:tc>
+      </w:tr>
+      <w:tr>
+        <w:tc>
+          <w:tcPr>
+            <w:tcW w:type="dxa" w:w="5112"/>
+            <w:vAlign w:val="top"/>
+          </w:tcPr>
+          <w:p>
+            <w:r/>
+            <w:r>
+              <w:rPr>
+                <w:b w:val="0"/>
+                <w:sz w:val="18"/>
+              </w:rPr>
+              <w:t>Dockerfile.airflow</w:t>
+            </w:r>
+          </w:p>
+        </w:tc>
+        <w:tc>
+          <w:tcPr>
+            <w:tcW w:type="dxa" w:w="5112"/>
+            <w:vAlign w:val="top"/>
+          </w:tcPr>
+          <w:p>
+            <w:r/>
+            <w:r>
+              <w:rPr>
+                <w:b w:val="0"/>
+                <w:sz w:val="18"/>
+              </w:rPr>
+              <w:t>Builds the custom Airflow image with Day 8 provider dependencies.</w:t>
+            </w:r>
+          </w:p>
+        </w:tc>
+      </w:tr>
+      <w:tr>
+        <w:tc>
+          <w:tcPr>
+            <w:tcW w:type="dxa" w:w="5112"/>
+            <w:vAlign w:val="top"/>
+          </w:tcPr>
+          <w:p>
+            <w:r/>
+            <w:r>
+              <w:rPr>
+                <w:b w:val="0"/>
+                <w:sz w:val="18"/>
+              </w:rPr>
+              <w:t>dags/</w:t>
+            </w:r>
+          </w:p>
+        </w:tc>
+        <w:tc>
+          <w:tcPr>
+            <w:tcW w:type="dxa" w:w="5112"/>
+            <w:vAlign w:val="top"/>
+          </w:tcPr>
+          <w:p>
+            <w:r/>
+            <w:r>
+              <w:rPr>
+                <w:b w:val="0"/>
+                <w:sz w:val="18"/>
+              </w:rPr>
+              <w:t>Ten Airflow DAGs used by the student labs.</w:t>
+            </w:r>
+          </w:p>
+        </w:tc>
+      </w:tr>
+      <w:tr>
+        <w:tc>
+          <w:tcPr>
+            <w:tcW w:type="dxa" w:w="5112"/>
+            <w:vAlign w:val="top"/>
+          </w:tcPr>
+          <w:p>
+            <w:r/>
+            <w:r>
+              <w:rPr>
+                <w:b w:val="0"/>
+                <w:sz w:val="18"/>
+              </w:rPr>
+              <w:t>dags/helpers/</w:t>
+            </w:r>
+          </w:p>
+        </w:tc>
+        <w:tc>
+          <w:tcPr>
+            <w:tcW w:type="dxa" w:w="5112"/>
+            <w:vAlign w:val="top"/>
+          </w:tcPr>
+          <w:p>
+            <w:r/>
+            <w:r>
+              <w:rPr>
+                <w:b w:val="0"/>
+                <w:sz w:val="18"/>
+              </w:rPr>
+              <w:t>Kafka and Hop helper functions used by orchestration DAGs.</w:t>
+            </w:r>
+          </w:p>
+        </w:tc>
+      </w:tr>
+      <w:tr>
+        <w:tc>
+          <w:tcPr>
+            <w:tcW w:type="dxa" w:w="5112"/>
+            <w:vAlign w:val="top"/>
+          </w:tcPr>
+          <w:p>
+            <w:r/>
+            <w:r>
+              <w:rPr>
+                <w:b w:val="0"/>
+                <w:sz w:val="18"/>
+              </w:rPr>
+              <w:t>data/</w:t>
+            </w:r>
+          </w:p>
+        </w:tc>
+        <w:tc>
+          <w:tcPr>
+            <w:tcW w:type="dxa" w:w="5112"/>
+            <w:vAlign w:val="top"/>
+          </w:tcPr>
+          <w:p>
+            <w:r/>
+            <w:r>
+              <w:rPr>
+                <w:b w:val="0"/>
+                <w:sz w:val="18"/>
+              </w:rPr>
+              <w:t>CSV source files mounted into Airflow as /opt/airflow/data.</w:t>
+            </w:r>
+          </w:p>
+        </w:tc>
+      </w:tr>
+      <w:tr>
+        <w:tc>
+          <w:tcPr>
+            <w:tcW w:type="dxa" w:w="5112"/>
+            <w:vAlign w:val="top"/>
+          </w:tcPr>
+          <w:p>
+            <w:r/>
+            <w:r>
+              <w:rPr>
+                <w:b w:val="0"/>
+                <w:sz w:val="18"/>
+              </w:rPr>
+              <w:t>hop/</w:t>
+            </w:r>
+          </w:p>
+        </w:tc>
+        <w:tc>
+          <w:tcPr>
+            <w:tcW w:type="dxa" w:w="5112"/>
+            <w:vAlign w:val="top"/>
+          </w:tcPr>
+          <w:p>
+            <w:r/>
+            <w:r>
+              <w:rPr>
+                <w:b w:val="0"/>
+                <w:sz w:val="18"/>
+              </w:rPr>
+              <w:t>Apache Hop project, pipelines, workflow, and mirrored data for Hop Web.</w:t>
+            </w:r>
+          </w:p>
+        </w:tc>
+      </w:tr>
+      <w:tr>
+        <w:tc>
+          <w:tcPr>
+            <w:tcW w:type="dxa" w:w="5112"/>
+            <w:vAlign w:val="top"/>
+          </w:tcPr>
+          <w:p>
+            <w:r/>
+            <w:r>
+              <w:rPr>
+                <w:b w:val="0"/>
+                <w:sz w:val="18"/>
+              </w:rPr>
+              <w:t>sql/init_warehouse.sql</w:t>
+            </w:r>
+          </w:p>
+        </w:tc>
+        <w:tc>
+          <w:tcPr>
+            <w:tcW w:type="dxa" w:w="5112"/>
+            <w:vAlign w:val="top"/>
+          </w:tcPr>
+          <w:p>
+            <w:r/>
+            <w:r>
+              <w:rPr>
+                <w:b w:val="0"/>
+                <w:sz w:val="18"/>
+              </w:rPr>
+              <w:t>Initializes Bronze, Silver, Gold, execution log, and quality tables in PostgreSQL.</w:t>
+            </w:r>
+          </w:p>
+        </w:tc>
+      </w:tr>
+      <w:tr>
+        <w:tc>
+          <w:tcPr>
+            <w:tcW w:type="dxa" w:w="5112"/>
+            <w:vAlign w:val="top"/>
+          </w:tcPr>
+          <w:p>
+            <w:r/>
+            <w:r>
+              <w:rPr>
+                <w:b w:val="0"/>
+                <w:sz w:val="18"/>
+              </w:rPr>
+              <w:t>scripts/kafka_producer.py</w:t>
+            </w:r>
+          </w:p>
+        </w:tc>
+        <w:tc>
+          <w:tcPr>
+            <w:tcW w:type="dxa" w:w="5112"/>
+            <w:vAlign w:val="top"/>
+          </w:tcPr>
+          <w:p>
+            <w:r/>
+            <w:r>
+              <w:rPr>
+                <w:b w:val="0"/>
+                <w:sz w:val="18"/>
+              </w:rPr>
+              <w:t>Generates order events for the Kafka labs.</w:t>
+            </w:r>
+          </w:p>
+        </w:tc>
+      </w:tr>
+      <w:tr>
+        <w:tc>
+          <w:tcPr>
+            <w:tcW w:type="dxa" w:w="5112"/>
+            <w:vAlign w:val="top"/>
+          </w:tcPr>
+          <w:p>
+            <w:r/>
+            <w:r>
+              <w:rPr>
+                <w:b w:val="0"/>
+                <w:sz w:val="18"/>
+              </w:rPr>
+              <w:t>scripts/verify_setup.py</w:t>
+            </w:r>
+          </w:p>
+        </w:tc>
+        <w:tc>
+          <w:tcPr>
+            <w:tcW w:type="dxa" w:w="5112"/>
+            <w:vAlign w:val="top"/>
+          </w:tcPr>
+          <w:p>
+            <w:r/>
+            <w:r>
+              <w:rPr>
+                <w:b w:val="0"/>
+                <w:sz w:val="18"/>
+              </w:rPr>
+              <w:t>Health-check script for the Day 8 services.</w:t>
+            </w:r>
+          </w:p>
+        </w:tc>
+      </w:tr>
+      <w:tr>
+        <w:tc>
+          <w:tcPr>
+            <w:tcW w:type="dxa" w:w="5112"/>
+            <w:vAlign w:val="top"/>
+          </w:tcPr>
+          <w:p>
+            <w:r/>
+            <w:r>
+              <w:rPr>
+                <w:b w:val="0"/>
+                <w:sz w:val="18"/>
+              </w:rPr>
+              <w:t>requirements.txt</w:t>
+            </w:r>
+          </w:p>
+        </w:tc>
+        <w:tc>
+          <w:tcPr>
+            <w:tcW w:type="dxa" w:w="5112"/>
+            <w:vAlign w:val="top"/>
+          </w:tcPr>
+          <w:p>
+            <w:r/>
+            <w:r>
+              <w:rPr>
+                <w:b w:val="0"/>
+                <w:sz w:val="18"/>
+              </w:rPr>
+              <w:t>Python dependencies installed in the custom Airflow image.</w:t>
             </w:r>
           </w:p>
         </w:tc>
@@ -70,99 +562,86 @@
         <w:pStyle w:val="Heading1"/>
       </w:pPr>
       <w:r>
-        <w:t>Installation Option A - Docker on Linux</w:t>
+        <w:t>Environment Setup</w:t>
+      </w:r>
+    </w:p>
+    <w:p>
+      <w:r>
+        <w:t>Start the full lab stack:</w:t>
       </w:r>
     </w:p>
     <w:p>
       <w:pPr>
-        <w:spacing w:before="80" w:after="160"/>
+        <w:pStyle w:val="NoSpacing"/>
+        <w:spacing w:after="120"/>
       </w:pPr>
       <w:r>
         <w:rPr>
-          <w:rFonts w:ascii="Consolas" w:hAnsi="Consolas" w:eastAsia="Consolas"/>
+          <w:rFonts w:ascii="Courier New" w:hAnsi="Courier New" w:eastAsia="Courier New"/>
+          <w:color w:val="232323"/>
           <w:sz w:val="17"/>
         </w:rPr>
-        <w:t>sudo apt-get update</w:t>
+        <w:t>cd Week_02\Day_08\Lab_Files</w:t>
       </w:r>
       <w:r>
         <w:br/>
       </w:r>
       <w:r>
         <w:rPr>
-          <w:rFonts w:ascii="Consolas" w:hAnsi="Consolas" w:eastAsia="Consolas"/>
+          <w:rFonts w:ascii="Courier New" w:hAnsi="Courier New" w:eastAsia="Courier New"/>
+          <w:color w:val="232323"/>
           <w:sz w:val="17"/>
         </w:rPr>
-        <w:t>sudo apt-get install -y ca-certificates curl gnupg</w:t>
+        <w:t>docker compose up -d --build</w:t>
       </w:r>
       <w:r>
         <w:br/>
       </w:r>
       <w:r>
         <w:rPr>
-          <w:rFonts w:ascii="Consolas" w:hAnsi="Consolas" w:eastAsia="Consolas"/>
+          <w:rFonts w:ascii="Courier New" w:hAnsi="Courier New" w:eastAsia="Courier New"/>
+          <w:color w:val="232323"/>
           <w:sz w:val="17"/>
         </w:rPr>
-        <w:t>sudo install -m 0755 -d /etc/apt/keyrings</w:t>
+        <w:t>docker compose ps</w:t>
       </w:r>
+    </w:p>
+    <w:p>
       <w:r>
-        <w:br/>
+        <w:t>Verify the services from inside the Airflow web container:</w:t>
       </w:r>
+    </w:p>
+    <w:p>
+      <w:pPr>
+        <w:pStyle w:val="NoSpacing"/>
+        <w:spacing w:after="120"/>
+      </w:pPr>
       <w:r>
         <w:rPr>
-          <w:rFonts w:ascii="Consolas" w:hAnsi="Consolas" w:eastAsia="Consolas"/>
+          <w:rFonts w:ascii="Courier New" w:hAnsi="Courier New" w:eastAsia="Courier New"/>
+          <w:color w:val="232323"/>
           <w:sz w:val="17"/>
         </w:rPr>
-        <w:t>curl -fsSL https://download.docker.com/linux/ubuntu/gpg | sudo gpg --dearmor -o /etc/apt/keyrings/docker.gpg</w:t>
+        <w:t>docker compose exec airflow-web python /opt/airflow/scripts/verify_setup.py</w:t>
       </w:r>
+    </w:p>
+    <w:p>
       <w:r>
-        <w:br/>
+        <w:t>Optional: start the Hop CLI profile if you want to experiment with real Hop CLI execution outside the simulated Airflow tasks:</w:t>
       </w:r>
+    </w:p>
+    <w:p>
+      <w:pPr>
+        <w:pStyle w:val="NoSpacing"/>
+        <w:spacing w:after="120"/>
+      </w:pPr>
       <w:r>
         <w:rPr>
-          <w:rFonts w:ascii="Consolas" w:hAnsi="Consolas" w:eastAsia="Consolas"/>
+          <w:rFonts w:ascii="Courier New" w:hAnsi="Courier New" w:eastAsia="Courier New"/>
+          <w:color w:val="232323"/>
           <w:sz w:val="17"/>
         </w:rPr>
-        <w:t>sudo chmod a+r /etc/apt/keyrings/docker.gpg</w:t>
-      </w:r>
-      <w:r>
-        <w:br/>
-      </w:r>
-      <w:r>
-        <w:rPr>
-          <w:rFonts w:ascii="Consolas" w:hAnsi="Consolas" w:eastAsia="Consolas"/>
-          <w:sz w:val="17"/>
-        </w:rPr>
-        <w:t>. /etc/os-release</w:t>
-      </w:r>
-      <w:r>
-        <w:br/>
-      </w:r>
-      <w:r>
-        <w:rPr>
-          <w:rFonts w:ascii="Consolas" w:hAnsi="Consolas" w:eastAsia="Consolas"/>
-          <w:sz w:val="17"/>
-        </w:rPr>
-        <w:t>echo "deb [arch=$(dpkg --print-architecture) signed-by=/etc/apt/keyrings/docker.gpg] https://download.docker.com/linux/ubuntu $VERSION_CODENAME stable" | sudo tee /etc/apt/sources.list.d/docker.list &gt; /dev/null</w:t>
-      </w:r>
-      <w:r>
-        <w:br/>
-      </w:r>
-      <w:r>
-        <w:rPr>
-          <w:rFonts w:ascii="Consolas" w:hAnsi="Consolas" w:eastAsia="Consolas"/>
-          <w:sz w:val="17"/>
-        </w:rPr>
-        <w:t>sudo apt-get update</w:t>
-      </w:r>
-      <w:r>
-        <w:br/>
-      </w:r>
-      <w:r>
-        <w:rPr>
-          <w:rFonts w:ascii="Consolas" w:hAnsi="Consolas" w:eastAsia="Consolas"/>
-          <w:sz w:val="17"/>
-        </w:rPr>
-        <w:t>sudo apt-get install -y docker-ce docker-ce-cli containerd.io docker-buildx-plugin docker-compose-plugin</w:t>
+        <w:t>docker compose --profile cli up -d hop-cli</w:t>
       </w:r>
     </w:p>
     <w:p>
@@ -170,164 +649,7 @@
         <w:pStyle w:val="Heading1"/>
       </w:pPr>
       <w:r>
-        <w:t>Installation Option B - Docker on Windows</w:t>
-      </w:r>
-    </w:p>
-    <w:p>
-      <w:pPr>
-        <w:pStyle w:val="ListNumber"/>
-      </w:pPr>
-      <w:r>
-        <w:t>Install Docker Desktop for Windows.</w:t>
-      </w:r>
-    </w:p>
-    <w:p>
-      <w:pPr>
-        <w:pStyle w:val="ListNumber"/>
-      </w:pPr>
-      <w:r>
-        <w:t>Enable WSL 2 backend.</w:t>
-      </w:r>
-    </w:p>
-    <w:p>
-      <w:pPr>
-        <w:pStyle w:val="ListNumber"/>
-      </w:pPr>
-      <w:r>
-        <w:t>Start Docker Desktop and wait for Docker Engine to run.</w:t>
-      </w:r>
-    </w:p>
-    <w:p>
-      <w:pPr>
-        <w:pStyle w:val="ListNumber"/>
-      </w:pPr>
-      <w:r>
-        <w:t>Open PowerShell or WSL Ubuntu.</w:t>
-      </w:r>
-    </w:p>
-    <w:p>
-      <w:pPr>
-        <w:pStyle w:val="ListNumber"/>
-      </w:pPr>
-      <w:r>
-        <w:t>Run docker --version and docker compose version.</w:t>
-      </w:r>
-    </w:p>
-    <w:p>
-      <w:pPr>
-        <w:pStyle w:val="ListNumber"/>
-      </w:pPr>
-      <w:r>
-        <w:t>Run this lab from Week_02/Day_08/Lab_Files.</w:t>
-      </w:r>
-    </w:p>
-    <w:p>
-      <w:pPr>
-        <w:pStyle w:val="Heading1"/>
-      </w:pPr>
-      <w:r>
-        <w:t>Manual Installation Notes</w:t>
-      </w:r>
-    </w:p>
-    <w:p>
-      <w:r>
-        <w:t>Docker is recommended. Manual setup requires Python, Airflow, Postgres, a scheduler process, webserver process, and matching provider dependencies. For classroom use, prefer the Compose route because it creates the same reproducible services for everyone.</w:t>
-      </w:r>
-    </w:p>
-    <w:p>
-      <w:pPr>
-        <w:pStyle w:val="Heading1"/>
-      </w:pPr>
-      <w:r>
-        <w:t>Corrections Included in This Lab Package</w:t>
-      </w:r>
-    </w:p>
-    <w:p>
-      <w:pPr>
-        <w:pStyle w:val="ListBullet"/>
-      </w:pPr>
-      <w:r>
-        <w:t>The data folder is mounted into /opt/airflow/data.</w:t>
-      </w:r>
-    </w:p>
-    <w:p>
-      <w:pPr>
-        <w:pStyle w:val="ListBullet"/>
-      </w:pPr>
-      <w:r>
-        <w:t>Airflow logs/plugins/data folders are writable by the Airflow container user.</w:t>
-      </w:r>
-    </w:p>
-    <w:p>
-      <w:pPr>
-        <w:pStyle w:val="ListBullet"/>
-      </w:pPr>
-      <w:r>
-        <w:t>The Airflow metadata DB is initialized automatically.</w:t>
-      </w:r>
-    </w:p>
-    <w:p>
-      <w:pPr>
-        <w:pStyle w:val="ListBullet"/>
-      </w:pPr>
-      <w:r>
-        <w:t>The admin/admin user is created automatically.</w:t>
-      </w:r>
-    </w:p>
-    <w:p>
-      <w:pPr>
-        <w:pStyle w:val="ListBullet"/>
-      </w:pPr>
-      <w:r>
-        <w:t>The fs_default connection is created for FileSensor.</w:t>
-      </w:r>
-    </w:p>
-    <w:p>
-      <w:pPr>
-        <w:pStyle w:val="ListBullet"/>
-      </w:pPr>
-      <w:r>
-        <w:t>The DAG uses csv and SQLAlchemy instead of requiring pandas.</w:t>
-      </w:r>
-    </w:p>
-    <w:p>
-      <w:pPr>
-        <w:pStyle w:val="Heading1"/>
-      </w:pPr>
-      <w:r>
-        <w:t>Step 1 - Start Airflow</w:t>
-      </w:r>
-    </w:p>
-    <w:p>
-      <w:pPr>
-        <w:spacing w:before="80" w:after="160"/>
-      </w:pPr>
-      <w:r>
-        <w:rPr>
-          <w:rFonts w:ascii="Consolas" w:hAnsi="Consolas" w:eastAsia="Consolas"/>
-          <w:sz w:val="17"/>
-        </w:rPr>
-        <w:t>cd Week_02/Day_08/Lab_Files</w:t>
-      </w:r>
-      <w:r>
-        <w:br/>
-      </w:r>
-      <w:r>
-        <w:rPr>
-          <w:rFonts w:ascii="Consolas" w:hAnsi="Consolas" w:eastAsia="Consolas"/>
-          <w:sz w:val="17"/>
-        </w:rPr>
-        <w:t>sudo docker compose up -d</w:t>
-      </w:r>
-      <w:r>
-        <w:br/>
-      </w:r>
-      <w:r>
-        <w:rPr>
-          <w:rFonts w:ascii="Consolas" w:hAnsi="Consolas" w:eastAsia="Consolas"/>
-          <w:sz w:val="17"/>
-        </w:rPr>
-        <w:t>sudo docker compose ps</w:t>
+        <w:t>Service Endpoints</w:t>
       </w:r>
     </w:p>
     <w:tbl>
@@ -338,44 +660,62 @@
         <w:tblLook w:firstColumn="1" w:firstRow="1" w:lastColumn="0" w:lastRow="0" w:noHBand="0" w:noVBand="1" w:val="04A0"/>
       </w:tblPr>
       <w:tblGrid>
-        <w:gridCol w:w="3456"/>
-        <w:gridCol w:w="3456"/>
-        <w:gridCol w:w="3456"/>
+        <w:gridCol w:w="3408"/>
+        <w:gridCol w:w="3408"/>
+        <w:gridCol w:w="3408"/>
       </w:tblGrid>
       <w:tr>
         <w:tc>
           <w:tcPr>
-            <w:tcW w:type="dxa" w:w="3456"/>
-            <w:shd w:fill="D9EAF7"/>
+            <w:tcW w:type="dxa" w:w="3408"/>
             <w:vAlign w:val="top"/>
+            <w:shd w:fill="1F4E79"/>
           </w:tcPr>
           <w:p>
+            <w:r/>
             <w:r>
+              <w:rPr>
+                <w:b/>
+                <w:color w:val="FFFFFF"/>
+                <w:sz w:val="18"/>
+              </w:rPr>
               <w:t>Service</w:t>
             </w:r>
           </w:p>
         </w:tc>
         <w:tc>
           <w:tcPr>
-            <w:tcW w:type="dxa" w:w="3456"/>
-            <w:shd w:fill="D9EAF7"/>
+            <w:tcW w:type="dxa" w:w="3408"/>
             <w:vAlign w:val="top"/>
+            <w:shd w:fill="1F4E79"/>
           </w:tcPr>
           <w:p>
+            <w:r/>
             <w:r>
-              <w:t>URL / Port</w:t>
+              <w:rPr>
+                <w:b/>
+                <w:color w:val="FFFFFF"/>
+                <w:sz w:val="18"/>
+              </w:rPr>
+              <w:t>URL or Port</w:t>
             </w:r>
           </w:p>
         </w:tc>
         <w:tc>
           <w:tcPr>
-            <w:tcW w:type="dxa" w:w="3456"/>
-            <w:shd w:fill="D9EAF7"/>
+            <w:tcW w:type="dxa" w:w="3408"/>
             <w:vAlign w:val="top"/>
+            <w:shd w:fill="1F4E79"/>
           </w:tcPr>
           <w:p>
+            <w:r/>
             <w:r>
-              <w:t>Purpose</w:t>
+              <w:rPr>
+                <w:b/>
+                <w:color w:val="FFFFFF"/>
+                <w:sz w:val="18"/>
+              </w:rPr>
+              <w:t>Credentials / Notes</w:t>
             </w:r>
           </w:p>
         </w:tc>
@@ -383,34 +723,49 @@
       <w:tr>
         <w:tc>
           <w:tcPr>
-            <w:tcW w:type="dxa" w:w="3456"/>
+            <w:tcW w:type="dxa" w:w="3408"/>
             <w:vAlign w:val="top"/>
           </w:tcPr>
           <w:p>
+            <w:r/>
             <w:r>
-              <w:t>Airflow webserver</w:t>
+              <w:rPr>
+                <w:b w:val="0"/>
+                <w:sz w:val="18"/>
+              </w:rPr>
+              <w:t>Airflow UI</w:t>
             </w:r>
           </w:p>
         </w:tc>
         <w:tc>
           <w:tcPr>
-            <w:tcW w:type="dxa" w:w="3456"/>
+            <w:tcW w:type="dxa" w:w="3408"/>
             <w:vAlign w:val="top"/>
           </w:tcPr>
           <w:p>
+            <w:r/>
             <w:r>
+              <w:rPr>
+                <w:b w:val="0"/>
+                <w:sz w:val="18"/>
+              </w:rPr>
               <w:t>http://localhost:8080</w:t>
             </w:r>
           </w:p>
         </w:tc>
         <w:tc>
           <w:tcPr>
-            <w:tcW w:type="dxa" w:w="3456"/>
+            <w:tcW w:type="dxa" w:w="3408"/>
             <w:vAlign w:val="top"/>
           </w:tcPr>
           <w:p>
+            <w:r/>
             <w:r>
-              <w:t>UI to trigger and observe the DAG.</w:t>
+              <w:rPr>
+                <w:b w:val="0"/>
+                <w:sz w:val="18"/>
+              </w:rPr>
+              <w:t>admin / admin</w:t>
             </w:r>
           </w:p>
         </w:tc>
@@ -418,34 +773,49 @@
       <w:tr>
         <w:tc>
           <w:tcPr>
-            <w:tcW w:type="dxa" w:w="3456"/>
+            <w:tcW w:type="dxa" w:w="3408"/>
             <w:vAlign w:val="top"/>
           </w:tcPr>
           <w:p>
+            <w:r/>
             <w:r>
-              <w:t>Airflow scheduler</w:t>
+              <w:rPr>
+                <w:b w:val="0"/>
+                <w:sz w:val="18"/>
+              </w:rPr>
+              <w:t>Kafka UI</w:t>
             </w:r>
           </w:p>
         </w:tc>
         <w:tc>
           <w:tcPr>
-            <w:tcW w:type="dxa" w:w="3456"/>
+            <w:tcW w:type="dxa" w:w="3408"/>
             <w:vAlign w:val="top"/>
           </w:tcPr>
           <w:p>
+            <w:r/>
             <w:r>
-              <w:t>internal</w:t>
+              <w:rPr>
+                <w:b w:val="0"/>
+                <w:sz w:val="18"/>
+              </w:rPr>
+              <w:t>http://localhost:8081</w:t>
             </w:r>
           </w:p>
         </w:tc>
         <w:tc>
           <w:tcPr>
-            <w:tcW w:type="dxa" w:w="3456"/>
+            <w:tcW w:type="dxa" w:w="3408"/>
             <w:vAlign w:val="top"/>
           </w:tcPr>
           <w:p>
+            <w:r/>
             <w:r>
-              <w:t>Schedules and runs tasks.</w:t>
+              <w:rPr>
+                <w:b w:val="0"/>
+                <w:sz w:val="18"/>
+              </w:rPr>
+              <w:t>No login configured</w:t>
             </w:r>
           </w:p>
         </w:tc>
@@ -453,45 +823,166 @@
       <w:tr>
         <w:tc>
           <w:tcPr>
-            <w:tcW w:type="dxa" w:w="3456"/>
+            <w:tcW w:type="dxa" w:w="3408"/>
             <w:vAlign w:val="top"/>
           </w:tcPr>
           <w:p>
+            <w:r/>
             <w:r>
-              <w:t>Postgres</w:t>
+              <w:rPr>
+                <w:b w:val="0"/>
+                <w:sz w:val="18"/>
+              </w:rPr>
+              <w:t>Apache Hop Web</w:t>
             </w:r>
           </w:p>
         </w:tc>
         <w:tc>
           <w:tcPr>
-            <w:tcW w:type="dxa" w:w="3456"/>
+            <w:tcW w:type="dxa" w:w="3408"/>
             <w:vAlign w:val="top"/>
           </w:tcPr>
           <w:p>
+            <w:r/>
             <w:r>
+              <w:rPr>
+                <w:b w:val="0"/>
+                <w:sz w:val="18"/>
+              </w:rPr>
+              <w:t>http://localhost:8082</w:t>
+            </w:r>
+          </w:p>
+        </w:tc>
+        <w:tc>
+          <w:tcPr>
+            <w:tcW w:type="dxa" w:w="3408"/>
+            <w:vAlign w:val="top"/>
+          </w:tcPr>
+          <w:p>
+            <w:r/>
+            <w:r>
+              <w:rPr>
+                <w:b w:val="0"/>
+                <w:sz w:val="18"/>
+              </w:rPr>
+              <w:t>Open the project under /project</w:t>
+            </w:r>
+          </w:p>
+        </w:tc>
+      </w:tr>
+      <w:tr>
+        <w:tc>
+          <w:tcPr>
+            <w:tcW w:type="dxa" w:w="3408"/>
+            <w:vAlign w:val="top"/>
+          </w:tcPr>
+          <w:p>
+            <w:r/>
+            <w:r>
+              <w:rPr>
+                <w:b w:val="0"/>
+                <w:sz w:val="18"/>
+              </w:rPr>
+              <w:t>PostgreSQL</w:t>
+            </w:r>
+          </w:p>
+        </w:tc>
+        <w:tc>
+          <w:tcPr>
+            <w:tcW w:type="dxa" w:w="3408"/>
+            <w:vAlign w:val="top"/>
+          </w:tcPr>
+          <w:p>
+            <w:r/>
+            <w:r>
+              <w:rPr>
+                <w:b w:val="0"/>
+                <w:sz w:val="18"/>
+              </w:rPr>
               <w:t>localhost:5432</w:t>
             </w:r>
           </w:p>
         </w:tc>
         <w:tc>
           <w:tcPr>
-            <w:tcW w:type="dxa" w:w="3456"/>
+            <w:tcW w:type="dxa" w:w="3408"/>
             <w:vAlign w:val="top"/>
           </w:tcPr>
           <w:p>
+            <w:r/>
             <w:r>
-              <w:t>Airflow metadata DB and lab Bronze/Silver/Gold tables.</w:t>
+              <w:rPr>
+                <w:b w:val="0"/>
+                <w:sz w:val="18"/>
+              </w:rPr>
+              <w:t>airflow / airflow, database airflow</w:t>
+            </w:r>
+          </w:p>
+        </w:tc>
+      </w:tr>
+      <w:tr>
+        <w:tc>
+          <w:tcPr>
+            <w:tcW w:type="dxa" w:w="3408"/>
+            <w:vAlign w:val="top"/>
+          </w:tcPr>
+          <w:p>
+            <w:r/>
+            <w:r>
+              <w:rPr>
+                <w:b w:val="0"/>
+                <w:sz w:val="18"/>
+              </w:rPr>
+              <w:t>Kafka broker from host</w:t>
+            </w:r>
+          </w:p>
+        </w:tc>
+        <w:tc>
+          <w:tcPr>
+            <w:tcW w:type="dxa" w:w="3408"/>
+            <w:vAlign w:val="top"/>
+          </w:tcPr>
+          <w:p>
+            <w:r/>
+            <w:r>
+              <w:rPr>
+                <w:b w:val="0"/>
+                <w:sz w:val="18"/>
+              </w:rPr>
+              <w:t>localhost:9092</w:t>
+            </w:r>
+          </w:p>
+        </w:tc>
+        <w:tc>
+          <w:tcPr>
+            <w:tcW w:type="dxa" w:w="3408"/>
+            <w:vAlign w:val="top"/>
+          </w:tcPr>
+          <w:p>
+            <w:r/>
+            <w:r>
+              <w:rPr>
+                <w:b w:val="0"/>
+                <w:sz w:val="18"/>
+              </w:rPr>
+              <w:t>Internal container broker is kafka:29092</w:t>
             </w:r>
           </w:p>
         </w:tc>
       </w:tr>
     </w:tbl>
+    <w:p/>
     <w:p>
       <w:pPr>
         <w:pStyle w:val="Heading1"/>
       </w:pPr>
       <w:r>
-        <w:t>Step 2 - Open Airflow UI</w:t>
+        <w:t>Lab Track Overview</w:t>
+      </w:r>
+    </w:p>
+    <w:p>
+      <w:r>
+        <w:t>Run the labs in order. Later labs reuse data, tables and ideas created by earlier labs.</w:t>
       </w:r>
     </w:p>
     <w:tbl>
@@ -502,31 +993,81 @@
         <w:tblLook w:firstColumn="1" w:firstRow="1" w:lastColumn="0" w:lastRow="0" w:noHBand="0" w:noVBand="1" w:val="04A0"/>
       </w:tblPr>
       <w:tblGrid>
-        <w:gridCol w:w="5184"/>
-        <w:gridCol w:w="5184"/>
+        <w:gridCol w:w="2556"/>
+        <w:gridCol w:w="2556"/>
+        <w:gridCol w:w="2556"/>
+        <w:gridCol w:w="2556"/>
       </w:tblGrid>
       <w:tr>
         <w:tc>
           <w:tcPr>
-            <w:tcW w:type="dxa" w:w="5184"/>
-            <w:shd w:fill="D9EAF7"/>
+            <w:tcW w:type="dxa" w:w="2556"/>
             <w:vAlign w:val="top"/>
+            <w:shd w:fill="1F4E79"/>
           </w:tcPr>
           <w:p>
+            <w:r/>
             <w:r>
-              <w:t>Field</w:t>
+              <w:rPr>
+                <w:b/>
+                <w:color w:val="FFFFFF"/>
+                <w:sz w:val="18"/>
+              </w:rPr>
+              <w:t>Lab</w:t>
             </w:r>
           </w:p>
         </w:tc>
         <w:tc>
           <w:tcPr>
-            <w:tcW w:type="dxa" w:w="5184"/>
-            <w:shd w:fill="D9EAF7"/>
+            <w:tcW w:type="dxa" w:w="2556"/>
             <w:vAlign w:val="top"/>
+            <w:shd w:fill="1F4E79"/>
           </w:tcPr>
           <w:p>
+            <w:r/>
             <w:r>
-              <w:t>Value</w:t>
+              <w:rPr>
+                <w:b/>
+                <w:color w:val="FFFFFF"/>
+                <w:sz w:val="18"/>
+              </w:rPr>
+              <w:t>DAG ID</w:t>
+            </w:r>
+          </w:p>
+        </w:tc>
+        <w:tc>
+          <w:tcPr>
+            <w:tcW w:type="dxa" w:w="2556"/>
+            <w:vAlign w:val="top"/>
+            <w:shd w:fill="1F4E79"/>
+          </w:tcPr>
+          <w:p>
+            <w:r/>
+            <w:r>
+              <w:rPr>
+                <w:b/>
+                <w:color w:val="FFFFFF"/>
+                <w:sz w:val="18"/>
+              </w:rPr>
+              <w:t>Focus</w:t>
+            </w:r>
+          </w:p>
+        </w:tc>
+        <w:tc>
+          <w:tcPr>
+            <w:tcW w:type="dxa" w:w="2556"/>
+            <w:vAlign w:val="top"/>
+            <w:shd w:fill="1F4E79"/>
+          </w:tcPr>
+          <w:p>
+            <w:r/>
+            <w:r>
+              <w:rPr>
+                <w:b/>
+                <w:color w:val="FFFFFF"/>
+                <w:sz w:val="18"/>
+              </w:rPr>
+              <w:t>Primary evidence</w:t>
             </w:r>
           </w:p>
         </w:tc>
@@ -534,23 +1075,65 @@
       <w:tr>
         <w:tc>
           <w:tcPr>
-            <w:tcW w:type="dxa" w:w="5184"/>
+            <w:tcW w:type="dxa" w:w="2556"/>
             <w:vAlign w:val="top"/>
           </w:tcPr>
           <w:p>
+            <w:r/>
             <w:r>
-              <w:t>URL</w:t>
+              <w:rPr>
+                <w:b w:val="0"/>
+                <w:sz w:val="18"/>
+              </w:rPr>
+              <w:t>1</w:t>
             </w:r>
           </w:p>
         </w:tc>
         <w:tc>
           <w:tcPr>
-            <w:tcW w:type="dxa" w:w="5184"/>
+            <w:tcW w:type="dxa" w:w="2556"/>
             <w:vAlign w:val="top"/>
           </w:tcPr>
           <w:p>
+            <w:r/>
             <w:r>
-              <w:t>http://localhost:8080</w:t>
+              <w:rPr>
+                <w:b w:val="0"/>
+                <w:sz w:val="18"/>
+              </w:rPr>
+              <w:t>01_hello_airflow</w:t>
+            </w:r>
+          </w:p>
+        </w:tc>
+        <w:tc>
+          <w:tcPr>
+            <w:tcW w:type="dxa" w:w="2556"/>
+            <w:vAlign w:val="top"/>
+          </w:tcPr>
+          <w:p>
+            <w:r/>
+            <w:r>
+              <w:rPr>
+                <w:b w:val="0"/>
+                <w:sz w:val="18"/>
+              </w:rPr>
+              <w:t>Airflow UI, BashOperator, PythonOperator, simple dependencies</w:t>
+            </w:r>
+          </w:p>
+        </w:tc>
+        <w:tc>
+          <w:tcPr>
+            <w:tcW w:type="dxa" w:w="2556"/>
+            <w:vAlign w:val="top"/>
+          </w:tcPr>
+          <w:p>
+            <w:r/>
+            <w:r>
+              <w:rPr>
+                <w:b w:val="0"/>
+                <w:sz w:val="18"/>
+              </w:rPr>
+              <w:t>Task logs and data directory listing</w:t>
             </w:r>
           </w:p>
         </w:tc>
@@ -558,23 +1141,65 @@
       <w:tr>
         <w:tc>
           <w:tcPr>
-            <w:tcW w:type="dxa" w:w="5184"/>
+            <w:tcW w:type="dxa" w:w="2556"/>
             <w:vAlign w:val="top"/>
           </w:tcPr>
           <w:p>
+            <w:r/>
             <w:r>
-              <w:t>Username</w:t>
+              <w:rPr>
+                <w:b w:val="0"/>
+                <w:sz w:val="18"/>
+              </w:rPr>
+              <w:t>2</w:t>
             </w:r>
           </w:p>
         </w:tc>
         <w:tc>
           <w:tcPr>
-            <w:tcW w:type="dxa" w:w="5184"/>
+            <w:tcW w:type="dxa" w:w="2556"/>
             <w:vAlign w:val="top"/>
           </w:tcPr>
           <w:p>
+            <w:r/>
             <w:r>
-              <w:t>admin</w:t>
+              <w:rPr>
+                <w:b w:val="0"/>
+                <w:sz w:val="18"/>
+              </w:rPr>
+              <w:t>02_operators_showcase</w:t>
+            </w:r>
+          </w:p>
+        </w:tc>
+        <w:tc>
+          <w:tcPr>
+            <w:tcW w:type="dxa" w:w="2556"/>
+            <w:vAlign w:val="top"/>
+          </w:tcPr>
+          <w:p>
+            <w:r/>
+            <w:r>
+              <w:rPr>
+                <w:b w:val="0"/>
+                <w:sz w:val="18"/>
+              </w:rPr>
+              <w:t>Bash templating, PostgresOperator, branching, short-circuiting</w:t>
+            </w:r>
+          </w:p>
+        </w:tc>
+        <w:tc>
+          <w:tcPr>
+            <w:tcW w:type="dxa" w:w="2556"/>
+            <w:vAlign w:val="top"/>
+          </w:tcPr>
+          <w:p>
+            <w:r/>
+            <w:r>
+              <w:rPr>
+                <w:b w:val="0"/>
+                <w:sz w:val="18"/>
+              </w:rPr>
+              <w:t>dag_audit_log and branch path logs</w:t>
             </w:r>
           </w:p>
         </w:tc>
@@ -582,31 +1207,623 @@
       <w:tr>
         <w:tc>
           <w:tcPr>
-            <w:tcW w:type="dxa" w:w="5184"/>
+            <w:tcW w:type="dxa" w:w="2556"/>
             <w:vAlign w:val="top"/>
           </w:tcPr>
           <w:p>
+            <w:r/>
             <w:r>
-              <w:t>Password</w:t>
+              <w:rPr>
+                <w:b w:val="0"/>
+                <w:sz w:val="18"/>
+              </w:rPr>
+              <w:t>3</w:t>
             </w:r>
           </w:p>
         </w:tc>
         <w:tc>
           <w:tcPr>
-            <w:tcW w:type="dxa" w:w="5184"/>
+            <w:tcW w:type="dxa" w:w="2556"/>
             <w:vAlign w:val="top"/>
           </w:tcPr>
           <w:p>
+            <w:r/>
             <w:r>
-              <w:t>admin</w:t>
+              <w:rPr>
+                <w:b w:val="0"/>
+                <w:sz w:val="18"/>
+              </w:rPr>
+              <w:t>03_medallion_pipeline</w:t>
+            </w:r>
+          </w:p>
+        </w:tc>
+        <w:tc>
+          <w:tcPr>
+            <w:tcW w:type="dxa" w:w="2556"/>
+            <w:vAlign w:val="top"/>
+          </w:tcPr>
+          <w:p>
+            <w:r/>
+            <w:r>
+              <w:rPr>
+                <w:b w:val="0"/>
+                <w:sz w:val="18"/>
+              </w:rPr>
+              <w:t>FileSensor, XCom, Bronze to Silver to Gold pipeline</w:t>
+            </w:r>
+          </w:p>
+        </w:tc>
+        <w:tc>
+          <w:tcPr>
+            <w:tcW w:type="dxa" w:w="2556"/>
+            <w:vAlign w:val="top"/>
+          </w:tcPr>
+          <w:p>
+            <w:r/>
+            <w:r>
+              <w:rPr>
+                <w:b w:val="0"/>
+                <w:sz w:val="18"/>
+              </w:rPr>
+              <w:t>bronze_orders, silver_orders, gold_customer_360, gold_daily_sales</w:t>
+            </w:r>
+          </w:p>
+        </w:tc>
+      </w:tr>
+      <w:tr>
+        <w:tc>
+          <w:tcPr>
+            <w:tcW w:type="dxa" w:w="2556"/>
+            <w:vAlign w:val="top"/>
+          </w:tcPr>
+          <w:p>
+            <w:r/>
+            <w:r>
+              <w:rPr>
+                <w:b w:val="0"/>
+                <w:sz w:val="18"/>
+              </w:rPr>
+              <w:t>4</w:t>
+            </w:r>
+          </w:p>
+        </w:tc>
+        <w:tc>
+          <w:tcPr>
+            <w:tcW w:type="dxa" w:w="2556"/>
+            <w:vAlign w:val="top"/>
+          </w:tcPr>
+          <w:p>
+            <w:r/>
+            <w:r>
+              <w:rPr>
+                <w:b w:val="0"/>
+                <w:sz w:val="18"/>
+              </w:rPr>
+              <w:t>04_sensor_patterns</w:t>
+            </w:r>
+          </w:p>
+        </w:tc>
+        <w:tc>
+          <w:tcPr>
+            <w:tcW w:type="dxa" w:w="2556"/>
+            <w:vAlign w:val="top"/>
+          </w:tcPr>
+          <w:p>
+            <w:r/>
+            <w:r>
+              <w:rPr>
+                <w:b w:val="0"/>
+                <w:sz w:val="18"/>
+              </w:rPr>
+              <w:t>File sensors, SQL checks, TimeDeltaSensor, scheduling</w:t>
+            </w:r>
+          </w:p>
+        </w:tc>
+        <w:tc>
+          <w:tcPr>
+            <w:tcW w:type="dxa" w:w="2556"/>
+            <w:vAlign w:val="top"/>
+          </w:tcPr>
+          <w:p>
+            <w:r/>
+            <w:r>
+              <w:rPr>
+                <w:b w:val="0"/>
+                <w:sz w:val="18"/>
+              </w:rPr>
+              <w:t>Sensor task state changes and schedule info log</w:t>
+            </w:r>
+          </w:p>
+        </w:tc>
+      </w:tr>
+      <w:tr>
+        <w:tc>
+          <w:tcPr>
+            <w:tcW w:type="dxa" w:w="2556"/>
+            <w:vAlign w:val="top"/>
+          </w:tcPr>
+          <w:p>
+            <w:r/>
+            <w:r>
+              <w:rPr>
+                <w:b w:val="0"/>
+                <w:sz w:val="18"/>
+              </w:rPr>
+              <w:t>5</w:t>
+            </w:r>
+          </w:p>
+        </w:tc>
+        <w:tc>
+          <w:tcPr>
+            <w:tcW w:type="dxa" w:w="2556"/>
+            <w:vAlign w:val="top"/>
+          </w:tcPr>
+          <w:p>
+            <w:r/>
+            <w:r>
+              <w:rPr>
+                <w:b w:val="0"/>
+                <w:sz w:val="18"/>
+              </w:rPr>
+              <w:t>05_xcom_and_taskflow</w:t>
+            </w:r>
+          </w:p>
+        </w:tc>
+        <w:tc>
+          <w:tcPr>
+            <w:tcW w:type="dxa" w:w="2556"/>
+            <w:vAlign w:val="top"/>
+          </w:tcPr>
+          <w:p>
+            <w:r/>
+            <w:r>
+              <w:rPr>
+                <w:b w:val="0"/>
+                <w:sz w:val="18"/>
+              </w:rPr>
+              <w:t>Traditional XCom compared with TaskFlow API</w:t>
+            </w:r>
+          </w:p>
+        </w:tc>
+        <w:tc>
+          <w:tcPr>
+            <w:tcW w:type="dxa" w:w="2556"/>
+            <w:vAlign w:val="top"/>
+          </w:tcPr>
+          <w:p>
+            <w:r/>
+            <w:r>
+              <w:rPr>
+                <w:b w:val="0"/>
+                <w:sz w:val="18"/>
+              </w:rPr>
+              <w:t>XCom records and BI report logs</w:t>
+            </w:r>
+          </w:p>
+        </w:tc>
+      </w:tr>
+      <w:tr>
+        <w:tc>
+          <w:tcPr>
+            <w:tcW w:type="dxa" w:w="2556"/>
+            <w:vAlign w:val="top"/>
+          </w:tcPr>
+          <w:p>
+            <w:r/>
+            <w:r>
+              <w:rPr>
+                <w:b w:val="0"/>
+                <w:sz w:val="18"/>
+              </w:rPr>
+              <w:t>6</w:t>
+            </w:r>
+          </w:p>
+        </w:tc>
+        <w:tc>
+          <w:tcPr>
+            <w:tcW w:type="dxa" w:w="2556"/>
+            <w:vAlign w:val="top"/>
+          </w:tcPr>
+          <w:p>
+            <w:r/>
+            <w:r>
+              <w:rPr>
+                <w:b w:val="0"/>
+                <w:sz w:val="18"/>
+              </w:rPr>
+              <w:t>06_dynamic_dags</w:t>
+            </w:r>
+          </w:p>
+        </w:tc>
+        <w:tc>
+          <w:tcPr>
+            <w:tcW w:type="dxa" w:w="2556"/>
+            <w:vAlign w:val="top"/>
+          </w:tcPr>
+          <w:p>
+            <w:r/>
+            <w:r>
+              <w:rPr>
+                <w:b w:val="0"/>
+                <w:sz w:val="18"/>
+              </w:rPr>
+              <w:t>Dynamic task mapping and TaskGroups</w:t>
+            </w:r>
+          </w:p>
+        </w:tc>
+        <w:tc>
+          <w:tcPr>
+            <w:tcW w:type="dxa" w:w="2556"/>
+            <w:vAlign w:val="top"/>
+          </w:tcPr>
+          <w:p>
+            <w:r/>
+            <w:r>
+              <w:rPr>
+                <w:b w:val="0"/>
+                <w:sz w:val="18"/>
+              </w:rPr>
+              <w:t>Mapped source validation and category analysis tasks</w:t>
+            </w:r>
+          </w:p>
+        </w:tc>
+      </w:tr>
+      <w:tr>
+        <w:tc>
+          <w:tcPr>
+            <w:tcW w:type="dxa" w:w="2556"/>
+            <w:vAlign w:val="top"/>
+          </w:tcPr>
+          <w:p>
+            <w:r/>
+            <w:r>
+              <w:rPr>
+                <w:b w:val="0"/>
+                <w:sz w:val="18"/>
+              </w:rPr>
+              <w:t>7</w:t>
+            </w:r>
+          </w:p>
+        </w:tc>
+        <w:tc>
+          <w:tcPr>
+            <w:tcW w:type="dxa" w:w="2556"/>
+            <w:vAlign w:val="top"/>
+          </w:tcPr>
+          <w:p>
+            <w:r/>
+            <w:r>
+              <w:rPr>
+                <w:b w:val="0"/>
+                <w:sz w:val="18"/>
+              </w:rPr>
+              <w:t>07_hop_integration</w:t>
+            </w:r>
+          </w:p>
+        </w:tc>
+        <w:tc>
+          <w:tcPr>
+            <w:tcW w:type="dxa" w:w="2556"/>
+            <w:vAlign w:val="top"/>
+          </w:tcPr>
+          <w:p>
+            <w:r/>
+            <w:r>
+              <w:rPr>
+                <w:b w:val="0"/>
+                <w:sz w:val="18"/>
+              </w:rPr>
+              <w:t>Airflow orchestration of Apache Hop assets</w:t>
+            </w:r>
+          </w:p>
+        </w:tc>
+        <w:tc>
+          <w:tcPr>
+            <w:tcW w:type="dxa" w:w="2556"/>
+            <w:vAlign w:val="top"/>
+          </w:tcPr>
+          <w:p>
+            <w:r/>
+            <w:r>
+              <w:rPr>
+                <w:b w:val="0"/>
+                <w:sz w:val="18"/>
+              </w:rPr>
+              <w:t>Hop Web project plus integration DAG logs</w:t>
+            </w:r>
+          </w:p>
+        </w:tc>
+      </w:tr>
+      <w:tr>
+        <w:tc>
+          <w:tcPr>
+            <w:tcW w:type="dxa" w:w="2556"/>
+            <w:vAlign w:val="top"/>
+          </w:tcPr>
+          <w:p>
+            <w:r/>
+            <w:r>
+              <w:rPr>
+                <w:b w:val="0"/>
+                <w:sz w:val="18"/>
+              </w:rPr>
+              <w:t>8</w:t>
+            </w:r>
+          </w:p>
+        </w:tc>
+        <w:tc>
+          <w:tcPr>
+            <w:tcW w:type="dxa" w:w="2556"/>
+            <w:vAlign w:val="top"/>
+          </w:tcPr>
+          <w:p>
+            <w:r/>
+            <w:r>
+              <w:rPr>
+                <w:b w:val="0"/>
+                <w:sz w:val="18"/>
+              </w:rPr>
+              <w:t>08_kafka_consumer_pipeline</w:t>
+            </w:r>
+          </w:p>
+        </w:tc>
+        <w:tc>
+          <w:tcPr>
+            <w:tcW w:type="dxa" w:w="2556"/>
+            <w:vAlign w:val="top"/>
+          </w:tcPr>
+          <w:p>
+            <w:r/>
+            <w:r>
+              <w:rPr>
+                <w:b w:val="0"/>
+                <w:sz w:val="18"/>
+              </w:rPr>
+              <w:t>Kafka micro-batch consumption into medallion tables</w:t>
+            </w:r>
+          </w:p>
+        </w:tc>
+        <w:tc>
+          <w:tcPr>
+            <w:tcW w:type="dxa" w:w="2556"/>
+            <w:vAlign w:val="top"/>
+          </w:tcPr>
+          <w:p>
+            <w:r/>
+            <w:r>
+              <w:rPr>
+                <w:b w:val="0"/>
+                <w:sz w:val="18"/>
+              </w:rPr>
+              <w:t>bronze_kafka_events and silver_orders</w:t>
+            </w:r>
+          </w:p>
+        </w:tc>
+      </w:tr>
+      <w:tr>
+        <w:tc>
+          <w:tcPr>
+            <w:tcW w:type="dxa" w:w="2556"/>
+            <w:vAlign w:val="top"/>
+          </w:tcPr>
+          <w:p>
+            <w:r/>
+            <w:r>
+              <w:rPr>
+                <w:b w:val="0"/>
+                <w:sz w:val="18"/>
+              </w:rPr>
+              <w:t>9</w:t>
+            </w:r>
+          </w:p>
+        </w:tc>
+        <w:tc>
+          <w:tcPr>
+            <w:tcW w:type="dxa" w:w="2556"/>
+            <w:vAlign w:val="top"/>
+          </w:tcPr>
+          <w:p>
+            <w:r/>
+            <w:r>
+              <w:rPr>
+                <w:b w:val="0"/>
+                <w:sz w:val="18"/>
+              </w:rPr>
+              <w:t>09_full_orchestration</w:t>
+            </w:r>
+          </w:p>
+        </w:tc>
+        <w:tc>
+          <w:tcPr>
+            <w:tcW w:type="dxa" w:w="2556"/>
+            <w:vAlign w:val="top"/>
+          </w:tcPr>
+          <w:p>
+            <w:r/>
+            <w:r>
+              <w:rPr>
+                <w:b w:val="0"/>
+                <w:sz w:val="18"/>
+              </w:rPr>
+              <w:t>Capstone orchestration across CSV, Kafka, Hop and Airflow</w:t>
+            </w:r>
+          </w:p>
+        </w:tc>
+        <w:tc>
+          <w:tcPr>
+            <w:tcW w:type="dxa" w:w="2556"/>
+            <w:vAlign w:val="top"/>
+          </w:tcPr>
+          <w:p>
+            <w:r/>
+            <w:r>
+              <w:rPr>
+                <w:b w:val="0"/>
+                <w:sz w:val="18"/>
+              </w:rPr>
+              <w:t>Quality gate results and executive summary log</w:t>
+            </w:r>
+          </w:p>
+        </w:tc>
+      </w:tr>
+      <w:tr>
+        <w:tc>
+          <w:tcPr>
+            <w:tcW w:type="dxa" w:w="2556"/>
+            <w:vAlign w:val="top"/>
+          </w:tcPr>
+          <w:p>
+            <w:r/>
+            <w:r>
+              <w:rPr>
+                <w:b w:val="0"/>
+                <w:sz w:val="18"/>
+              </w:rPr>
+              <w:t>10</w:t>
+            </w:r>
+          </w:p>
+        </w:tc>
+        <w:tc>
+          <w:tcPr>
+            <w:tcW w:type="dxa" w:w="2556"/>
+            <w:vAlign w:val="top"/>
+          </w:tcPr>
+          <w:p>
+            <w:r/>
+            <w:r>
+              <w:rPr>
+                <w:b w:val="0"/>
+                <w:sz w:val="18"/>
+              </w:rPr>
+              <w:t>10_advanced_patterns</w:t>
+            </w:r>
+          </w:p>
+        </w:tc>
+        <w:tc>
+          <w:tcPr>
+            <w:tcW w:type="dxa" w:w="2556"/>
+            <w:vAlign w:val="top"/>
+          </w:tcPr>
+          <w:p>
+            <w:r/>
+            <w:r>
+              <w:rPr>
+                <w:b w:val="0"/>
+                <w:sz w:val="18"/>
+              </w:rPr>
+              <w:t>Variables, callbacks, idempotency, branching, TriggerDagRunOperator, monitoring</w:t>
+            </w:r>
+          </w:p>
+        </w:tc>
+        <w:tc>
+          <w:tcPr>
+            <w:tcW w:type="dxa" w:w="2556"/>
+            <w:vAlign w:val="top"/>
+          </w:tcPr>
+          <w:p>
+            <w:r/>
+            <w:r>
+              <w:rPr>
+                <w:b w:val="0"/>
+                <w:sz w:val="18"/>
+              </w:rPr>
+              <w:t>pipeline_summary and callback/monitoring logs</w:t>
             </w:r>
           </w:p>
         </w:tc>
       </w:tr>
     </w:tbl>
+    <w:p/>
+    <w:p>
+      <w:pPr>
+        <w:pStyle w:val="Heading1"/>
+      </w:pPr>
+      <w:r>
+        <w:t>Common Commands</w:t>
+      </w:r>
+    </w:p>
     <w:p>
       <w:r>
-        <w:t>The medallion_pipeline DAG should appear without import errors and should be unpaused.</w:t>
+        <w:t>Trigger any DAG from the command line:</w:t>
+      </w:r>
+    </w:p>
+    <w:p>
+      <w:pPr>
+        <w:pStyle w:val="NoSpacing"/>
+        <w:spacing w:after="120"/>
+      </w:pPr>
+      <w:r>
+        <w:rPr>
+          <w:rFonts w:ascii="Courier New" w:hAnsi="Courier New" w:eastAsia="Courier New"/>
+          <w:color w:val="232323"/>
+          <w:sz w:val="17"/>
+        </w:rPr>
+        <w:t>docker compose exec airflow-web airflow dags trigger &lt;dag_id&gt;</w:t>
+      </w:r>
+    </w:p>
+    <w:p>
+      <w:r>
+        <w:t>Inspect task logs through the Airflow UI: DAG -&gt; Grid -&gt; select task instance -&gt; Logs.</w:t>
+      </w:r>
+    </w:p>
+    <w:p>
+      <w:r>
+        <w:t>Query PostgreSQL tables:</w:t>
+      </w:r>
+    </w:p>
+    <w:p>
+      <w:pPr>
+        <w:pStyle w:val="NoSpacing"/>
+        <w:spacing w:after="120"/>
+      </w:pPr>
+      <w:r>
+        <w:rPr>
+          <w:rFonts w:ascii="Courier New" w:hAnsi="Courier New" w:eastAsia="Courier New"/>
+          <w:color w:val="232323"/>
+          <w:sz w:val="17"/>
+        </w:rPr>
+        <w:t>docker compose exec postgres psql -U airflow -d airflow -c "SELECT COUNT(*) FROM bronze_orders;"</w:t>
+      </w:r>
+      <w:r>
+        <w:br/>
+      </w:r>
+      <w:r>
+        <w:rPr>
+          <w:rFonts w:ascii="Courier New" w:hAnsi="Courier New" w:eastAsia="Courier New"/>
+          <w:color w:val="232323"/>
+          <w:sz w:val="17"/>
+        </w:rPr>
+        <w:t>docker compose exec postgres psql -U airflow -d airflow -c "SELECT COUNT(*) FROM silver_orders;"</w:t>
+      </w:r>
+      <w:r>
+        <w:br/>
+      </w:r>
+      <w:r>
+        <w:rPr>
+          <w:rFonts w:ascii="Courier New" w:hAnsi="Courier New" w:eastAsia="Courier New"/>
+          <w:color w:val="232323"/>
+          <w:sz w:val="17"/>
+        </w:rPr>
+        <w:t>docker compose exec postgres psql -U airflow -d airflow -c "SELECT COUNT(*) FROM gold_customer_360;"</w:t>
+      </w:r>
+    </w:p>
+    <w:p>
+      <w:r>
+        <w:t>Generate Kafka events for Labs 8 and 9:</w:t>
+      </w:r>
+    </w:p>
+    <w:p>
+      <w:pPr>
+        <w:pStyle w:val="NoSpacing"/>
+        <w:spacing w:after="120"/>
+      </w:pPr>
+      <w:r>
+        <w:rPr>
+          <w:rFonts w:ascii="Courier New" w:hAnsi="Courier New" w:eastAsia="Courier New"/>
+          <w:color w:val="232323"/>
+          <w:sz w:val="17"/>
+        </w:rPr>
+        <w:t>docker compose exec airflow-web python /opt/airflow/scripts/kafka_producer.py --count 20</w:t>
       </w:r>
     </w:p>
     <w:p>
@@ -614,164 +1831,15 @@
         <w:pStyle w:val="Heading1"/>
       </w:pPr>
       <w:r>
-        <w:t>Step 3 - Trigger the DAG</w:t>
-      </w:r>
-    </w:p>
-    <w:p>
-      <w:r>
-        <w:t>Trigger medallion_pipeline from the UI or CLI. CLI example:</w:t>
+        <w:t>Lab Instructions</w:t>
       </w:r>
     </w:p>
     <w:p>
       <w:pPr>
-        <w:spacing w:before="80" w:after="160"/>
+        <w:pStyle w:val="Heading2"/>
       </w:pPr>
       <w:r>
-        <w:rPr>
-          <w:rFonts w:ascii="Consolas" w:hAnsi="Consolas" w:eastAsia="Consolas"/>
-          <w:sz w:val="17"/>
-        </w:rPr>
-        <w:t>RUN_ID="manual__day8_success_$(date +%Y%m%dT%H%M%S)"</w:t>
-      </w:r>
-      <w:r>
-        <w:br/>
-      </w:r>
-      <w:r>
-        <w:rPr>
-          <w:rFonts w:ascii="Consolas" w:hAnsi="Consolas" w:eastAsia="Consolas"/>
-          <w:sz w:val="17"/>
-        </w:rPr>
-        <w:t>sudo docker compose exec airflow-scheduler airflow dags trigger medallion_pipeline --run-id "$RUN_ID"</w:t>
-      </w:r>
-    </w:p>
-    <w:p>
-      <w:r>
-        <w:t>A successful run shows all tasks green: wait_for_csv, load_bronze, transform_silver, and aggregate_gold.</w:t>
-      </w:r>
-    </w:p>
-    <w:p>
-      <w:r>
-        <w:drawing>
-          <wp:inline xmlns:a="http://schemas.openxmlformats.org/drawingml/2006/main" xmlns:pic="http://schemas.openxmlformats.org/drawingml/2006/picture">
-            <wp:extent cx="6126480" cy="3675888"/>
-            <wp:docPr id="1" name="Picture 1"/>
-            <wp:cNvGraphicFramePr>
-              <a:graphicFrameLocks noChangeAspect="1"/>
-            </wp:cNvGraphicFramePr>
-            <a:graphic>
-              <a:graphicData uri="http://schemas.openxmlformats.org/drawingml/2006/picture">
-                <pic:pic>
-                  <pic:nvPicPr>
-                    <pic:cNvPr id="0" name="01-airflow-dag-summary-real.png"/>
-                    <pic:cNvPicPr/>
-                  </pic:nvPicPr>
-                  <pic:blipFill>
-                    <a:blip r:embed="rId9"/>
-                    <a:stretch>
-                      <a:fillRect/>
-                    </a:stretch>
-                  </pic:blipFill>
-                  <pic:spPr>
-                    <a:xfrm>
-                      <a:off x="0" y="0"/>
-                      <a:ext cx="6126480" cy="3675888"/>
-                    </a:xfrm>
-                    <a:prstGeom prst="rect"/>
-                  </pic:spPr>
-                </pic:pic>
-              </a:graphicData>
-            </a:graphic>
-          </wp:inline>
-        </w:drawing>
-      </w:r>
-    </w:p>
-    <w:p>
-      <w:pPr>
-        <w:pStyle w:val="Heading1"/>
-      </w:pPr>
-      <w:r>
-        <w:t>Step 4 - Inspect the Graph View</w:t>
-      </w:r>
-    </w:p>
-    <w:p>
-      <w:r>
-        <w:t>Use the Graph tab to verify the dependency chain and task state colors.</w:t>
-      </w:r>
-    </w:p>
-    <w:p>
-      <w:r>
-        <w:drawing>
-          <wp:inline xmlns:a="http://schemas.openxmlformats.org/drawingml/2006/main" xmlns:pic="http://schemas.openxmlformats.org/drawingml/2006/picture">
-            <wp:extent cx="6126480" cy="3675888"/>
-            <wp:docPr id="2" name="Picture 2"/>
-            <wp:cNvGraphicFramePr>
-              <a:graphicFrameLocks noChangeAspect="1"/>
-            </wp:cNvGraphicFramePr>
-            <a:graphic>
-              <a:graphicData uri="http://schemas.openxmlformats.org/drawingml/2006/picture">
-                <pic:pic>
-                  <pic:nvPicPr>
-                    <pic:cNvPr id="0" name="02-airflow-graph-real.png"/>
-                    <pic:cNvPicPr/>
-                  </pic:nvPicPr>
-                  <pic:blipFill>
-                    <a:blip r:embed="rId10"/>
-                    <a:stretch>
-                      <a:fillRect/>
-                    </a:stretch>
-                  </pic:blipFill>
-                  <pic:spPr>
-                    <a:xfrm>
-                      <a:off x="0" y="0"/>
-                      <a:ext cx="6126480" cy="3675888"/>
-                    </a:xfrm>
-                    <a:prstGeom prst="rect"/>
-                  </pic:spPr>
-                </pic:pic>
-              </a:graphicData>
-            </a:graphic>
-          </wp:inline>
-        </w:drawing>
-      </w:r>
-    </w:p>
-    <w:p>
-      <w:pPr>
-        <w:pStyle w:val="Heading1"/>
-      </w:pPr>
-      <w:r>
-        <w:t>Step 5 - Validate Tables</w:t>
-      </w:r>
-    </w:p>
-    <w:p>
-      <w:pPr>
-        <w:spacing w:before="80" w:after="160"/>
-      </w:pPr>
-      <w:r>
-        <w:rPr>
-          <w:rFonts w:ascii="Consolas" w:hAnsi="Consolas" w:eastAsia="Consolas"/>
-          <w:sz w:val="17"/>
-        </w:rPr>
-        <w:t>sudo docker compose exec postgres psql -U airflow -d airflow -c "SELECT COUNT(*) AS bronze_rows FROM bronze_orders;"</w:t>
-      </w:r>
-      <w:r>
-        <w:br/>
-      </w:r>
-      <w:r>
-        <w:rPr>
-          <w:rFonts w:ascii="Consolas" w:hAnsi="Consolas" w:eastAsia="Consolas"/>
-          <w:sz w:val="17"/>
-        </w:rPr>
-        <w:t>sudo docker compose exec postgres psql -U airflow -d airflow -c "SELECT COUNT(*) AS silver_rows FROM silver_orders;"</w:t>
-      </w:r>
-      <w:r>
-        <w:br/>
-      </w:r>
-      <w:r>
-        <w:rPr>
-          <w:rFonts w:ascii="Consolas" w:hAnsi="Consolas" w:eastAsia="Consolas"/>
-          <w:sz w:val="17"/>
-        </w:rPr>
-        <w:t>sudo docker compose exec postgres psql -U airflow -d airflow -c "SELECT * FROM gold_order_summary ORDER BY total_spent DESC;"</w:t>
+        <w:t>Lab 1: Hello Airflow</w:t>
       </w:r>
     </w:p>
     <w:tbl>
@@ -782,44 +1850,62 @@
         <w:tblLook w:firstColumn="1" w:firstRow="1" w:lastColumn="0" w:lastRow="0" w:noHBand="0" w:noVBand="1" w:val="04A0"/>
       </w:tblPr>
       <w:tblGrid>
-        <w:gridCol w:w="3456"/>
-        <w:gridCol w:w="3456"/>
-        <w:gridCol w:w="3456"/>
+        <w:gridCol w:w="3408"/>
+        <w:gridCol w:w="3408"/>
+        <w:gridCol w:w="3408"/>
       </w:tblGrid>
       <w:tr>
         <w:tc>
           <w:tcPr>
-            <w:tcW w:type="dxa" w:w="3456"/>
-            <w:shd w:fill="D9EAF7"/>
+            <w:tcW w:type="dxa" w:w="2592"/>
             <w:vAlign w:val="top"/>
+            <w:shd w:fill="1F4E79"/>
           </w:tcPr>
           <w:p>
+            <w:r/>
             <w:r>
-              <w:t>Layer</w:t>
+              <w:rPr>
+                <w:b/>
+                <w:color w:val="FFFFFF"/>
+                <w:sz w:val="18"/>
+              </w:rPr>
+              <w:t>DAG</w:t>
             </w:r>
           </w:p>
         </w:tc>
         <w:tc>
           <w:tcPr>
-            <w:tcW w:type="dxa" w:w="3456"/>
-            <w:shd w:fill="D9EAF7"/>
+            <w:tcW w:type="dxa" w:w="1440"/>
             <w:vAlign w:val="top"/>
+            <w:shd w:fill="1F4E79"/>
           </w:tcPr>
           <w:p>
+            <w:r/>
             <w:r>
-              <w:t>Evidence</w:t>
+              <w:rPr>
+                <w:b/>
+                <w:color w:val="FFFFFF"/>
+                <w:sz w:val="18"/>
+              </w:rPr>
+              <w:t>Time</w:t>
             </w:r>
           </w:p>
         </w:tc>
         <w:tc>
           <w:tcPr>
-            <w:tcW w:type="dxa" w:w="3456"/>
-            <w:shd w:fill="D9EAF7"/>
+            <w:tcW w:type="dxa" w:w="6624"/>
             <w:vAlign w:val="top"/>
+            <w:shd w:fill="1F4E79"/>
           </w:tcPr>
           <w:p>
+            <w:r/>
             <w:r>
-              <w:t>Meaning</w:t>
+              <w:rPr>
+                <w:b/>
+                <w:color w:val="FFFFFF"/>
+                <w:sz w:val="18"/>
+              </w:rPr>
+              <w:t>Purpose</w:t>
             </w:r>
           </w:p>
         </w:tc>
@@ -827,34 +1913,196 @@
       <w:tr>
         <w:tc>
           <w:tcPr>
-            <w:tcW w:type="dxa" w:w="3456"/>
+            <w:tcW w:type="dxa" w:w="2592"/>
             <w:vAlign w:val="top"/>
           </w:tcPr>
           <w:p>
+            <w:r/>
             <w:r>
-              <w:t>Bronze</w:t>
+              <w:rPr>
+                <w:b w:val="0"/>
+                <w:sz w:val="18"/>
+              </w:rPr>
+              <w:t>01_hello_airflow</w:t>
             </w:r>
           </w:p>
         </w:tc>
         <w:tc>
           <w:tcPr>
-            <w:tcW w:type="dxa" w:w="3456"/>
+            <w:tcW w:type="dxa" w:w="1440"/>
             <w:vAlign w:val="top"/>
           </w:tcPr>
           <w:p>
+            <w:r/>
             <w:r>
-              <w:t>5 rows</w:t>
+              <w:rPr>
+                <w:b w:val="0"/>
+                <w:sz w:val="18"/>
+              </w:rPr>
+              <w:t>45 min</w:t>
             </w:r>
           </w:p>
         </w:tc>
         <w:tc>
           <w:tcPr>
-            <w:tcW w:type="dxa" w:w="3456"/>
+            <w:tcW w:type="dxa" w:w="6624"/>
             <w:vAlign w:val="top"/>
           </w:tcPr>
           <w:p>
+            <w:r/>
             <w:r>
-              <w:t>All rows from new_orders.csv were loaded, including the quantity=0 row.</w:t>
+              <w:rPr>
+                <w:b w:val="0"/>
+                <w:sz w:val="18"/>
+              </w:rPr>
+              <w:t>Introduce the Airflow UI, manual DAG runs, task dependencies, BashOperator and PythonOperator.</w:t>
+            </w:r>
+          </w:p>
+        </w:tc>
+      </w:tr>
+    </w:tbl>
+    <w:p/>
+    <w:p>
+      <w:r>
+        <w:t>Run</w:t>
+      </w:r>
+    </w:p>
+    <w:p>
+      <w:pPr>
+        <w:pStyle w:val="NoSpacing"/>
+        <w:spacing w:after="120"/>
+      </w:pPr>
+      <w:r>
+        <w:rPr>
+          <w:rFonts w:ascii="Courier New" w:hAnsi="Courier New" w:eastAsia="Courier New"/>
+          <w:color w:val="232323"/>
+          <w:sz w:val="17"/>
+        </w:rPr>
+        <w:t>docker compose exec airflow-web airflow dags trigger 01_hello_airflow</w:t>
+      </w:r>
+    </w:p>
+    <w:p>
+      <w:r>
+        <w:t>Student Tasks</w:t>
+      </w:r>
+    </w:p>
+    <w:p>
+      <w:pPr>
+        <w:pStyle w:val="ListNumber"/>
+      </w:pPr>
+      <w:r>
+        <w:t>Open Airflow at http://localhost:8080 and find 01_hello_airflow.</w:t>
+      </w:r>
+    </w:p>
+    <w:p>
+      <w:pPr>
+        <w:pStyle w:val="ListNumber"/>
+      </w:pPr>
+      <w:r>
+        <w:t>Use Graph view to identify the start, Bash, Python and end tasks.</w:t>
+      </w:r>
+    </w:p>
+    <w:p>
+      <w:pPr>
+        <w:pStyle w:val="ListNumber"/>
+      </w:pPr>
+      <w:r>
+        <w:t>Open logs for print_date, list_data_files, greet and show_environment.</w:t>
+      </w:r>
+    </w:p>
+    <w:p>
+      <w:pPr>
+        <w:pStyle w:val="ListNumber"/>
+      </w:pPr>
+      <w:r>
+        <w:t>Confirm that /opt/airflow/data shows the Day 8 CSV files.</w:t>
+      </w:r>
+    </w:p>
+    <w:p>
+      <w:r>
+        <w:t>Challenge</w:t>
+      </w:r>
+    </w:p>
+    <w:p>
+      <w:pPr>
+        <w:pStyle w:val="ListBullet"/>
+      </w:pPr>
+      <w:r>
+        <w:t>Add a BashOperator that counts files under /opt/airflow/dags and observe the new task in Graph view.</w:t>
+      </w:r>
+    </w:p>
+    <w:p>
+      <w:pPr>
+        <w:pStyle w:val="Heading2"/>
+      </w:pPr>
+      <w:r>
+        <w:t>Lab 2: Operators Showcase</w:t>
+      </w:r>
+    </w:p>
+    <w:tbl>
+      <w:tblPr>
+        <w:tblStyle w:val="TableGrid"/>
+        <w:tblW w:type="auto" w:w="0"/>
+        <w:jc w:val="center"/>
+        <w:tblLook w:firstColumn="1" w:firstRow="1" w:lastColumn="0" w:lastRow="0" w:noHBand="0" w:noVBand="1" w:val="04A0"/>
+      </w:tblPr>
+      <w:tblGrid>
+        <w:gridCol w:w="3408"/>
+        <w:gridCol w:w="3408"/>
+        <w:gridCol w:w="3408"/>
+      </w:tblGrid>
+      <w:tr>
+        <w:tc>
+          <w:tcPr>
+            <w:tcW w:type="dxa" w:w="2592"/>
+            <w:vAlign w:val="top"/>
+            <w:shd w:fill="1F4E79"/>
+          </w:tcPr>
+          <w:p>
+            <w:r/>
+            <w:r>
+              <w:rPr>
+                <w:b/>
+                <w:color w:val="FFFFFF"/>
+                <w:sz w:val="18"/>
+              </w:rPr>
+              <w:t>DAG</w:t>
+            </w:r>
+          </w:p>
+        </w:tc>
+        <w:tc>
+          <w:tcPr>
+            <w:tcW w:type="dxa" w:w="1440"/>
+            <w:vAlign w:val="top"/>
+            <w:shd w:fill="1F4E79"/>
+          </w:tcPr>
+          <w:p>
+            <w:r/>
+            <w:r>
+              <w:rPr>
+                <w:b/>
+                <w:color w:val="FFFFFF"/>
+                <w:sz w:val="18"/>
+              </w:rPr>
+              <w:t>Time</w:t>
+            </w:r>
+          </w:p>
+        </w:tc>
+        <w:tc>
+          <w:tcPr>
+            <w:tcW w:type="dxa" w:w="6624"/>
+            <w:vAlign w:val="top"/>
+            <w:shd w:fill="1F4E79"/>
+          </w:tcPr>
+          <w:p>
+            <w:r/>
+            <w:r>
+              <w:rPr>
+                <w:b/>
+                <w:color w:val="FFFFFF"/>
+                <w:sz w:val="18"/>
+              </w:rPr>
+              <w:t>Purpose</w:t>
             </w:r>
           </w:p>
         </w:tc>
@@ -862,34 +2110,207 @@
       <w:tr>
         <w:tc>
           <w:tcPr>
-            <w:tcW w:type="dxa" w:w="3456"/>
+            <w:tcW w:type="dxa" w:w="2592"/>
             <w:vAlign w:val="top"/>
           </w:tcPr>
           <w:p>
+            <w:r/>
             <w:r>
-              <w:t>Silver</w:t>
+              <w:rPr>
+                <w:b w:val="0"/>
+                <w:sz w:val="18"/>
+              </w:rPr>
+              <w:t>02_operators_showcase</w:t>
             </w:r>
           </w:p>
         </w:tc>
         <w:tc>
           <w:tcPr>
-            <w:tcW w:type="dxa" w:w="3456"/>
+            <w:tcW w:type="dxa" w:w="1440"/>
             <w:vAlign w:val="top"/>
           </w:tcPr>
           <w:p>
+            <w:r/>
             <w:r>
-              <w:t>4 rows</w:t>
+              <w:rPr>
+                <w:b w:val="0"/>
+                <w:sz w:val="18"/>
+              </w:rPr>
+              <w:t>60 min</w:t>
             </w:r>
           </w:p>
         </w:tc>
         <w:tc>
           <w:tcPr>
-            <w:tcW w:type="dxa" w:w="3456"/>
+            <w:tcW w:type="dxa" w:w="6624"/>
             <w:vAlign w:val="top"/>
           </w:tcPr>
           <w:p>
+            <w:r/>
             <w:r>
-              <w:t>The invalid quantity=0 row was filtered out.</w:t>
+              <w:rPr>
+                <w:b w:val="0"/>
+                <w:sz w:val="18"/>
+              </w:rPr>
+              <w:t>Practice templated Bash commands, SQL execution, ShortCircuitOperator and BranchPythonOperator.</w:t>
+            </w:r>
+          </w:p>
+        </w:tc>
+      </w:tr>
+    </w:tbl>
+    <w:p/>
+    <w:p>
+      <w:r>
+        <w:t>Run</w:t>
+      </w:r>
+    </w:p>
+    <w:p>
+      <w:pPr>
+        <w:pStyle w:val="NoSpacing"/>
+        <w:spacing w:after="120"/>
+      </w:pPr>
+      <w:r>
+        <w:rPr>
+          <w:rFonts w:ascii="Courier New" w:hAnsi="Courier New" w:eastAsia="Courier New"/>
+          <w:color w:val="232323"/>
+          <w:sz w:val="17"/>
+        </w:rPr>
+        <w:t>docker compose exec airflow-web airflow dags trigger 02_operators_showcase</w:t>
+      </w:r>
+      <w:r>
+        <w:br/>
+      </w:r>
+      <w:r>
+        <w:rPr>
+          <w:rFonts w:ascii="Courier New" w:hAnsi="Courier New" w:eastAsia="Courier New"/>
+          <w:color w:val="232323"/>
+          <w:sz w:val="17"/>
+        </w:rPr>
+        <w:t>docker compose exec postgres psql -U airflow -d airflow -c "SELECT * FROM dag_audit_log ORDER BY run_ts DESC LIMIT 5;"</w:t>
+      </w:r>
+    </w:p>
+    <w:p>
+      <w:r>
+        <w:t>Student Tasks</w:t>
+      </w:r>
+    </w:p>
+    <w:p>
+      <w:pPr>
+        <w:pStyle w:val="ListNumber"/>
+      </w:pPr>
+      <w:r>
+        <w:t>Trigger the DAG more than once and compare the branch path chosen by the random number task.</w:t>
+      </w:r>
+    </w:p>
+    <w:p>
+      <w:pPr>
+        <w:pStyle w:val="ListNumber"/>
+      </w:pPr>
+      <w:r>
+        <w:t>Review the bash_with_template task log and identify templated values such as ds and run_id.</w:t>
+      </w:r>
+    </w:p>
+    <w:p>
+      <w:pPr>
+        <w:pStyle w:val="ListNumber"/>
+      </w:pPr>
+      <w:r>
+        <w:t>Inspect skipped tasks after weekday_only_gate and decide_branch.</w:t>
+      </w:r>
+    </w:p>
+    <w:p>
+      <w:pPr>
+        <w:pStyle w:val="ListNumber"/>
+      </w:pPr>
+      <w:r>
+        <w:t>Verify that audit records are written to PostgreSQL.</w:t>
+      </w:r>
+    </w:p>
+    <w:p>
+      <w:r>
+        <w:t>Challenge</w:t>
+      </w:r>
+    </w:p>
+    <w:p>
+      <w:pPr>
+        <w:pStyle w:val="ListBullet"/>
+      </w:pPr>
+      <w:r>
+        <w:t>Add a branch path for random numbers greater than 75 named very_high_value_path.</w:t>
+      </w:r>
+    </w:p>
+    <w:p>
+      <w:pPr>
+        <w:pStyle w:val="Heading2"/>
+      </w:pPr>
+      <w:r>
+        <w:t>Lab 3: Medallion Pipeline</w:t>
+      </w:r>
+    </w:p>
+    <w:tbl>
+      <w:tblPr>
+        <w:tblStyle w:val="TableGrid"/>
+        <w:tblW w:type="auto" w:w="0"/>
+        <w:jc w:val="center"/>
+        <w:tblLook w:firstColumn="1" w:firstRow="1" w:lastColumn="0" w:lastRow="0" w:noHBand="0" w:noVBand="1" w:val="04A0"/>
+      </w:tblPr>
+      <w:tblGrid>
+        <w:gridCol w:w="3408"/>
+        <w:gridCol w:w="3408"/>
+        <w:gridCol w:w="3408"/>
+      </w:tblGrid>
+      <w:tr>
+        <w:tc>
+          <w:tcPr>
+            <w:tcW w:type="dxa" w:w="2592"/>
+            <w:vAlign w:val="top"/>
+            <w:shd w:fill="1F4E79"/>
+          </w:tcPr>
+          <w:p>
+            <w:r/>
+            <w:r>
+              <w:rPr>
+                <w:b/>
+                <w:color w:val="FFFFFF"/>
+                <w:sz w:val="18"/>
+              </w:rPr>
+              <w:t>DAG</w:t>
+            </w:r>
+          </w:p>
+        </w:tc>
+        <w:tc>
+          <w:tcPr>
+            <w:tcW w:type="dxa" w:w="1440"/>
+            <w:vAlign w:val="top"/>
+            <w:shd w:fill="1F4E79"/>
+          </w:tcPr>
+          <w:p>
+            <w:r/>
+            <w:r>
+              <w:rPr>
+                <w:b/>
+                <w:color w:val="FFFFFF"/>
+                <w:sz w:val="18"/>
+              </w:rPr>
+              <w:t>Time</w:t>
+            </w:r>
+          </w:p>
+        </w:tc>
+        <w:tc>
+          <w:tcPr>
+            <w:tcW w:type="dxa" w:w="6624"/>
+            <w:vAlign w:val="top"/>
+            <w:shd w:fill="1F4E79"/>
+          </w:tcPr>
+          <w:p>
+            <w:r/>
+            <w:r>
+              <w:rPr>
+                <w:b/>
+                <w:color w:val="FFFFFF"/>
+                <w:sz w:val="18"/>
+              </w:rPr>
+              <w:t>Purpose</w:t>
             </w:r>
           </w:p>
         </w:tc>
@@ -897,69 +2318,1641 @@
       <w:tr>
         <w:tc>
           <w:tcPr>
-            <w:tcW w:type="dxa" w:w="3456"/>
+            <w:tcW w:type="dxa" w:w="2592"/>
             <w:vAlign w:val="top"/>
           </w:tcPr>
           <w:p>
+            <w:r/>
             <w:r>
-              <w:t>Gold</w:t>
+              <w:rPr>
+                <w:b w:val="0"/>
+                <w:sz w:val="18"/>
+              </w:rPr>
+              <w:t>03_medallion_pipeline</w:t>
             </w:r>
           </w:p>
         </w:tc>
         <w:tc>
           <w:tcPr>
-            <w:tcW w:type="dxa" w:w="3456"/>
+            <w:tcW w:type="dxa" w:w="1440"/>
             <w:vAlign w:val="top"/>
           </w:tcPr>
           <w:p>
+            <w:r/>
             <w:r>
-              <w:t>2 customer rows</w:t>
+              <w:rPr>
+                <w:b w:val="0"/>
+                <w:sz w:val="18"/>
+              </w:rPr>
+              <w:t>60 min</w:t>
             </w:r>
           </w:p>
         </w:tc>
         <w:tc>
           <w:tcPr>
-            <w:tcW w:type="dxa" w:w="3456"/>
+            <w:tcW w:type="dxa" w:w="6624"/>
             <w:vAlign w:val="top"/>
           </w:tcPr>
           <w:p>
+            <w:r/>
             <w:r>
-              <w:t>Customer-level spend totals were aggregated from Silver.</w:t>
+              <w:rPr>
+                <w:b w:val="0"/>
+                <w:sz w:val="18"/>
+              </w:rPr>
+              <w:t>Load CSV source data into Bronze, cleanse into Silver, aggregate into Gold, and log lineage metadata.</w:t>
             </w:r>
           </w:p>
         </w:tc>
       </w:tr>
     </w:tbl>
+    <w:p/>
+    <w:p>
+      <w:r>
+        <w:t>Run</w:t>
+      </w:r>
+    </w:p>
     <w:p>
       <w:pPr>
-        <w:spacing w:before="80" w:after="160"/>
+        <w:pStyle w:val="NoSpacing"/>
+        <w:spacing w:after="120"/>
       </w:pPr>
       <w:r>
         <w:rPr>
-          <w:rFonts w:ascii="Consolas" w:hAnsi="Consolas" w:eastAsia="Consolas"/>
+          <w:rFonts w:ascii="Courier New" w:hAnsi="Courier New" w:eastAsia="Courier New"/>
+          <w:color w:val="232323"/>
           <w:sz w:val="17"/>
         </w:rPr>
-        <w:t>customer_id | total_spent | order_count</w:t>
+        <w:t>docker compose exec airflow-web airflow dags trigger 03_medallion_pipeline</w:t>
       </w:r>
       <w:r>
         <w:br/>
       </w:r>
       <w:r>
         <w:rPr>
-          <w:rFonts w:ascii="Consolas" w:hAnsi="Consolas" w:eastAsia="Consolas"/>
+          <w:rFonts w:ascii="Courier New" w:hAnsi="Courier New" w:eastAsia="Courier New"/>
+          <w:color w:val="232323"/>
           <w:sz w:val="17"/>
         </w:rPr>
-        <w:t>2           | 98.99       | 2</w:t>
+        <w:t>docker compose exec postgres psql -U airflow -d airflow -c "SELECT COUNT(*) AS bronze_orders FROM bronze_orders;"</w:t>
       </w:r>
       <w:r>
         <w:br/>
       </w:r>
       <w:r>
         <w:rPr>
-          <w:rFonts w:ascii="Consolas" w:hAnsi="Consolas" w:eastAsia="Consolas"/>
+          <w:rFonts w:ascii="Courier New" w:hAnsi="Courier New" w:eastAsia="Courier New"/>
+          <w:color w:val="232323"/>
           <w:sz w:val="17"/>
         </w:rPr>
-        <w:t>1           | 65.50       | 2</w:t>
+        <w:t>docker compose exec postgres psql -U airflow -d airflow -c "SELECT COUNT(*) AS silver_orders FROM silver_orders;"</w:t>
+      </w:r>
+      <w:r>
+        <w:br/>
+      </w:r>
+      <w:r>
+        <w:rPr>
+          <w:rFonts w:ascii="Courier New" w:hAnsi="Courier New" w:eastAsia="Courier New"/>
+          <w:color w:val="232323"/>
+          <w:sz w:val="17"/>
+        </w:rPr>
+        <w:t>docker compose exec postgres psql -U airflow -d airflow -c "SELECT * FROM gold_customer_360 ORDER BY total_revenue DESC;"</w:t>
+      </w:r>
+      <w:r>
+        <w:br/>
+      </w:r>
+      <w:r>
+        <w:rPr>
+          <w:rFonts w:ascii="Courier New" w:hAnsi="Courier New" w:eastAsia="Courier New"/>
+          <w:color w:val="232323"/>
+          <w:sz w:val="17"/>
+        </w:rPr>
+        <w:t>docker compose exec postgres psql -U airflow -d airflow -c "SELECT * FROM gold_daily_sales ORDER BY order_date;"</w:t>
+      </w:r>
+    </w:p>
+    <w:p>
+      <w:r>
+        <w:t>Student Tasks</w:t>
+      </w:r>
+    </w:p>
+    <w:p>
+      <w:pPr>
+        <w:pStyle w:val="ListNumber"/>
+      </w:pPr>
+      <w:r>
+        <w:t>Find the two FileSensor tasks: wait_for_orders_csv and wait_for_customers_csv.</w:t>
+      </w:r>
+    </w:p>
+    <w:p>
+      <w:pPr>
+        <w:pStyle w:val="ListNumber"/>
+      </w:pPr>
+      <w:r>
+        <w:t>Observe parallel Bronze loads, parallel Silver transforms, and parallel Gold builds.</w:t>
+      </w:r>
+    </w:p>
+    <w:p>
+      <w:pPr>
+        <w:pStyle w:val="ListNumber"/>
+      </w:pPr>
+      <w:r>
+        <w:t>Review XCom values for bronze_count, silver_count and gold counts.</w:t>
+      </w:r>
+    </w:p>
+    <w:p>
+      <w:pPr>
+        <w:pStyle w:val="ListNumber"/>
+      </w:pPr>
+      <w:r>
+        <w:t>Inspect pipeline_execution_log for the summary row.</w:t>
+      </w:r>
+    </w:p>
+    <w:p>
+      <w:r>
+        <w:t>Challenge</w:t>
+      </w:r>
+    </w:p>
+    <w:p>
+      <w:pPr>
+        <w:pStyle w:val="ListBullet"/>
+      </w:pPr>
+      <w:r>
+        <w:t>Add a product performance Gold task that writes to gold_product_performance.</w:t>
+      </w:r>
+    </w:p>
+    <w:p>
+      <w:pPr>
+        <w:pStyle w:val="Heading2"/>
+      </w:pPr>
+      <w:r>
+        <w:t>Lab 4: Sensors And Scheduling</w:t>
+      </w:r>
+    </w:p>
+    <w:tbl>
+      <w:tblPr>
+        <w:tblStyle w:val="TableGrid"/>
+        <w:tblW w:type="auto" w:w="0"/>
+        <w:jc w:val="center"/>
+        <w:tblLook w:firstColumn="1" w:firstRow="1" w:lastColumn="0" w:lastRow="0" w:noHBand="0" w:noVBand="1" w:val="04A0"/>
+      </w:tblPr>
+      <w:tblGrid>
+        <w:gridCol w:w="3408"/>
+        <w:gridCol w:w="3408"/>
+        <w:gridCol w:w="3408"/>
+      </w:tblGrid>
+      <w:tr>
+        <w:tc>
+          <w:tcPr>
+            <w:tcW w:type="dxa" w:w="2592"/>
+            <w:vAlign w:val="top"/>
+            <w:shd w:fill="1F4E79"/>
+          </w:tcPr>
+          <w:p>
+            <w:r/>
+            <w:r>
+              <w:rPr>
+                <w:b/>
+                <w:color w:val="FFFFFF"/>
+                <w:sz w:val="18"/>
+              </w:rPr>
+              <w:t>DAG</w:t>
+            </w:r>
+          </w:p>
+        </w:tc>
+        <w:tc>
+          <w:tcPr>
+            <w:tcW w:type="dxa" w:w="1440"/>
+            <w:vAlign w:val="top"/>
+            <w:shd w:fill="1F4E79"/>
+          </w:tcPr>
+          <w:p>
+            <w:r/>
+            <w:r>
+              <w:rPr>
+                <w:b/>
+                <w:color w:val="FFFFFF"/>
+                <w:sz w:val="18"/>
+              </w:rPr>
+              <w:t>Time</w:t>
+            </w:r>
+          </w:p>
+        </w:tc>
+        <w:tc>
+          <w:tcPr>
+            <w:tcW w:type="dxa" w:w="6624"/>
+            <w:vAlign w:val="top"/>
+            <w:shd w:fill="1F4E79"/>
+          </w:tcPr>
+          <w:p>
+            <w:r/>
+            <w:r>
+              <w:rPr>
+                <w:b/>
+                <w:color w:val="FFFFFF"/>
+                <w:sz w:val="18"/>
+              </w:rPr>
+              <w:t>Purpose</w:t>
+            </w:r>
+          </w:p>
+        </w:tc>
+      </w:tr>
+      <w:tr>
+        <w:tc>
+          <w:tcPr>
+            <w:tcW w:type="dxa" w:w="2592"/>
+            <w:vAlign w:val="top"/>
+          </w:tcPr>
+          <w:p>
+            <w:r/>
+            <w:r>
+              <w:rPr>
+                <w:b w:val="0"/>
+                <w:sz w:val="18"/>
+              </w:rPr>
+              <w:t>04_sensor_patterns</w:t>
+            </w:r>
+          </w:p>
+        </w:tc>
+        <w:tc>
+          <w:tcPr>
+            <w:tcW w:type="dxa" w:w="1440"/>
+            <w:vAlign w:val="top"/>
+          </w:tcPr>
+          <w:p>
+            <w:r/>
+            <w:r>
+              <w:rPr>
+                <w:b w:val="0"/>
+                <w:sz w:val="18"/>
+              </w:rPr>
+              <w:t>45 min</w:t>
+            </w:r>
+          </w:p>
+        </w:tc>
+        <w:tc>
+          <w:tcPr>
+            <w:tcW w:type="dxa" w:w="6624"/>
+            <w:vAlign w:val="top"/>
+          </w:tcPr>
+          <w:p>
+            <w:r/>
+            <w:r>
+              <w:rPr>
+                <w:b w:val="0"/>
+                <w:sz w:val="18"/>
+              </w:rPr>
+              <w:t>Compare poke and reschedule sensor modes, use SQL data checks, and read cron schedule behavior.</w:t>
+            </w:r>
+          </w:p>
+        </w:tc>
+      </w:tr>
+    </w:tbl>
+    <w:p/>
+    <w:p>
+      <w:r>
+        <w:t>Run</w:t>
+      </w:r>
+    </w:p>
+    <w:p>
+      <w:pPr>
+        <w:pStyle w:val="NoSpacing"/>
+        <w:spacing w:after="120"/>
+      </w:pPr>
+      <w:r>
+        <w:rPr>
+          <w:rFonts w:ascii="Courier New" w:hAnsi="Courier New" w:eastAsia="Courier New"/>
+          <w:color w:val="232323"/>
+          <w:sz w:val="17"/>
+        </w:rPr>
+        <w:t>docker compose exec airflow-web airflow dags trigger 04_sensor_patterns</w:t>
+      </w:r>
+    </w:p>
+    <w:p>
+      <w:r>
+        <w:t>Student Tasks</w:t>
+      </w:r>
+    </w:p>
+    <w:p>
+      <w:pPr>
+        <w:pStyle w:val="ListNumber"/>
+      </w:pPr>
+      <w:r>
+        <w:t>Compare wait_orders_poke_mode and wait_products_reschedule_mode in the Grid view.</w:t>
+      </w:r>
+    </w:p>
+    <w:p>
+      <w:pPr>
+        <w:pStyle w:val="ListNumber"/>
+      </w:pPr>
+      <w:r>
+        <w:t>Review ensure_tables_exist and check_data_freshness logs.</w:t>
+      </w:r>
+    </w:p>
+    <w:p>
+      <w:pPr>
+        <w:pStyle w:val="ListNumber"/>
+      </w:pPr>
+      <w:r>
+        <w:t>Read the schedule expression */30 9-17 * * 1-5 and explain when it runs.</w:t>
+      </w:r>
+    </w:p>
+    <w:p>
+      <w:pPr>
+        <w:pStyle w:val="ListNumber"/>
+      </w:pPr>
+      <w:r>
+        <w:t>Notice trigger rules on always_runs and end.</w:t>
+      </w:r>
+    </w:p>
+    <w:p>
+      <w:r>
+        <w:t>Challenge</w:t>
+      </w:r>
+    </w:p>
+    <w:p>
+      <w:pPr>
+        <w:pStyle w:val="ListBullet"/>
+      </w:pPr>
+      <w:r>
+        <w:t>Create an SqlSensor-style check that waits until silver_orders has more than 10 rows.</w:t>
+      </w:r>
+    </w:p>
+    <w:p>
+      <w:pPr>
+        <w:pStyle w:val="Heading2"/>
+      </w:pPr>
+      <w:r>
+        <w:t>Lab 5: XCom And TaskFlow API</w:t>
+      </w:r>
+    </w:p>
+    <w:tbl>
+      <w:tblPr>
+        <w:tblStyle w:val="TableGrid"/>
+        <w:tblW w:type="auto" w:w="0"/>
+        <w:jc w:val="center"/>
+        <w:tblLook w:firstColumn="1" w:firstRow="1" w:lastColumn="0" w:lastRow="0" w:noHBand="0" w:noVBand="1" w:val="04A0"/>
+      </w:tblPr>
+      <w:tblGrid>
+        <w:gridCol w:w="3408"/>
+        <w:gridCol w:w="3408"/>
+        <w:gridCol w:w="3408"/>
+      </w:tblGrid>
+      <w:tr>
+        <w:tc>
+          <w:tcPr>
+            <w:tcW w:type="dxa" w:w="2592"/>
+            <w:vAlign w:val="top"/>
+            <w:shd w:fill="1F4E79"/>
+          </w:tcPr>
+          <w:p>
+            <w:r/>
+            <w:r>
+              <w:rPr>
+                <w:b/>
+                <w:color w:val="FFFFFF"/>
+                <w:sz w:val="18"/>
+              </w:rPr>
+              <w:t>DAG</w:t>
+            </w:r>
+          </w:p>
+        </w:tc>
+        <w:tc>
+          <w:tcPr>
+            <w:tcW w:type="dxa" w:w="1440"/>
+            <w:vAlign w:val="top"/>
+            <w:shd w:fill="1F4E79"/>
+          </w:tcPr>
+          <w:p>
+            <w:r/>
+            <w:r>
+              <w:rPr>
+                <w:b/>
+                <w:color w:val="FFFFFF"/>
+                <w:sz w:val="18"/>
+              </w:rPr>
+              <w:t>Time</w:t>
+            </w:r>
+          </w:p>
+        </w:tc>
+        <w:tc>
+          <w:tcPr>
+            <w:tcW w:type="dxa" w:w="6624"/>
+            <w:vAlign w:val="top"/>
+            <w:shd w:fill="1F4E79"/>
+          </w:tcPr>
+          <w:p>
+            <w:r/>
+            <w:r>
+              <w:rPr>
+                <w:b/>
+                <w:color w:val="FFFFFF"/>
+                <w:sz w:val="18"/>
+              </w:rPr>
+              <w:t>Purpose</w:t>
+            </w:r>
+          </w:p>
+        </w:tc>
+      </w:tr>
+      <w:tr>
+        <w:tc>
+          <w:tcPr>
+            <w:tcW w:type="dxa" w:w="2592"/>
+            <w:vAlign w:val="top"/>
+          </w:tcPr>
+          <w:p>
+            <w:r/>
+            <w:r>
+              <w:rPr>
+                <w:b w:val="0"/>
+                <w:sz w:val="18"/>
+              </w:rPr>
+              <w:t>05_xcom_and_taskflow</w:t>
+            </w:r>
+          </w:p>
+        </w:tc>
+        <w:tc>
+          <w:tcPr>
+            <w:tcW w:type="dxa" w:w="1440"/>
+            <w:vAlign w:val="top"/>
+          </w:tcPr>
+          <w:p>
+            <w:r/>
+            <w:r>
+              <w:rPr>
+                <w:b w:val="0"/>
+                <w:sz w:val="18"/>
+              </w:rPr>
+              <w:t>60 min</w:t>
+            </w:r>
+          </w:p>
+        </w:tc>
+        <w:tc>
+          <w:tcPr>
+            <w:tcW w:type="dxa" w:w="6624"/>
+            <w:vAlign w:val="top"/>
+          </w:tcPr>
+          <w:p>
+            <w:r/>
+            <w:r>
+              <w:rPr>
+                <w:b w:val="0"/>
+                <w:sz w:val="18"/>
+              </w:rPr>
+              <w:t>Compare explicit XCom push/pull with TaskFlow function arguments and return values.</w:t>
+            </w:r>
+          </w:p>
+        </w:tc>
+      </w:tr>
+    </w:tbl>
+    <w:p/>
+    <w:p>
+      <w:r>
+        <w:t>Run</w:t>
+      </w:r>
+    </w:p>
+    <w:p>
+      <w:pPr>
+        <w:pStyle w:val="NoSpacing"/>
+        <w:spacing w:after="120"/>
+      </w:pPr>
+      <w:r>
+        <w:rPr>
+          <w:rFonts w:ascii="Courier New" w:hAnsi="Courier New" w:eastAsia="Courier New"/>
+          <w:color w:val="232323"/>
+          <w:sz w:val="17"/>
+        </w:rPr>
+        <w:t>docker compose exec airflow-web airflow dags trigger 03_medallion_pipeline</w:t>
+      </w:r>
+      <w:r>
+        <w:br/>
+      </w:r>
+      <w:r>
+        <w:rPr>
+          <w:rFonts w:ascii="Courier New" w:hAnsi="Courier New" w:eastAsia="Courier New"/>
+          <w:color w:val="232323"/>
+          <w:sz w:val="17"/>
+        </w:rPr>
+        <w:t>docker compose exec airflow-web airflow dags trigger 05_xcom_and_taskflow</w:t>
+      </w:r>
+    </w:p>
+    <w:p>
+      <w:r>
+        <w:t>Student Tasks</w:t>
+      </w:r>
+    </w:p>
+    <w:p>
+      <w:pPr>
+        <w:pStyle w:val="ListNumber"/>
+      </w:pPr>
+      <w:r>
+        <w:t>Run 03_medallion_pipeline first so Silver and Gold tables have data.</w:t>
+      </w:r>
+    </w:p>
+    <w:p>
+      <w:pPr>
+        <w:pStyle w:val="ListNumber"/>
+      </w:pPr>
+      <w:r>
+        <w:t>Compare extract_stats_traditional/report_traditional with the TaskFlow section in the Graph view.</w:t>
+      </w:r>
+    </w:p>
+    <w:p>
+      <w:pPr>
+        <w:pStyle w:val="ListNumber"/>
+      </w:pPr>
+      <w:r>
+        <w:t>Open Admin -&gt; XComs and compare stored keys and return values.</w:t>
+      </w:r>
+    </w:p>
+    <w:p>
+      <w:pPr>
+        <w:pStyle w:val="ListNumber"/>
+      </w:pPr>
+      <w:r>
+        <w:t>Read the report task logs and identify which values flowed through XCom.</w:t>
+      </w:r>
+    </w:p>
+    <w:p>
+      <w:r>
+        <w:t>Challenge</w:t>
+      </w:r>
+    </w:p>
+    <w:p>
+      <w:pPr>
+        <w:pStyle w:val="ListBullet"/>
+      </w:pPr>
+      <w:r>
+        <w:t>Add a TaskFlow @task that calculates an additional KPI, such as average revenue per active customer.</w:t>
+      </w:r>
+    </w:p>
+    <w:p>
+      <w:pPr>
+        <w:pStyle w:val="Heading2"/>
+      </w:pPr>
+      <w:r>
+        <w:t>Lab 6: Dynamic DAGs And Task Groups</w:t>
+      </w:r>
+    </w:p>
+    <w:tbl>
+      <w:tblPr>
+        <w:tblStyle w:val="TableGrid"/>
+        <w:tblW w:type="auto" w:w="0"/>
+        <w:jc w:val="center"/>
+        <w:tblLook w:firstColumn="1" w:firstRow="1" w:lastColumn="0" w:lastRow="0" w:noHBand="0" w:noVBand="1" w:val="04A0"/>
+      </w:tblPr>
+      <w:tblGrid>
+        <w:gridCol w:w="3408"/>
+        <w:gridCol w:w="3408"/>
+        <w:gridCol w:w="3408"/>
+      </w:tblGrid>
+      <w:tr>
+        <w:tc>
+          <w:tcPr>
+            <w:tcW w:type="dxa" w:w="2592"/>
+            <w:vAlign w:val="top"/>
+            <w:shd w:fill="1F4E79"/>
+          </w:tcPr>
+          <w:p>
+            <w:r/>
+            <w:r>
+              <w:rPr>
+                <w:b/>
+                <w:color w:val="FFFFFF"/>
+                <w:sz w:val="18"/>
+              </w:rPr>
+              <w:t>DAG</w:t>
+            </w:r>
+          </w:p>
+        </w:tc>
+        <w:tc>
+          <w:tcPr>
+            <w:tcW w:type="dxa" w:w="1440"/>
+            <w:vAlign w:val="top"/>
+            <w:shd w:fill="1F4E79"/>
+          </w:tcPr>
+          <w:p>
+            <w:r/>
+            <w:r>
+              <w:rPr>
+                <w:b/>
+                <w:color w:val="FFFFFF"/>
+                <w:sz w:val="18"/>
+              </w:rPr>
+              <w:t>Time</w:t>
+            </w:r>
+          </w:p>
+        </w:tc>
+        <w:tc>
+          <w:tcPr>
+            <w:tcW w:type="dxa" w:w="6624"/>
+            <w:vAlign w:val="top"/>
+            <w:shd w:fill="1F4E79"/>
+          </w:tcPr>
+          <w:p>
+            <w:r/>
+            <w:r>
+              <w:rPr>
+                <w:b/>
+                <w:color w:val="FFFFFF"/>
+                <w:sz w:val="18"/>
+              </w:rPr>
+              <w:t>Purpose</w:t>
+            </w:r>
+          </w:p>
+        </w:tc>
+      </w:tr>
+      <w:tr>
+        <w:tc>
+          <w:tcPr>
+            <w:tcW w:type="dxa" w:w="2592"/>
+            <w:vAlign w:val="top"/>
+          </w:tcPr>
+          <w:p>
+            <w:r/>
+            <w:r>
+              <w:rPr>
+                <w:b w:val="0"/>
+                <w:sz w:val="18"/>
+              </w:rPr>
+              <w:t>06_dynamic_dags</w:t>
+            </w:r>
+          </w:p>
+        </w:tc>
+        <w:tc>
+          <w:tcPr>
+            <w:tcW w:type="dxa" w:w="1440"/>
+            <w:vAlign w:val="top"/>
+          </w:tcPr>
+          <w:p>
+            <w:r/>
+            <w:r>
+              <w:rPr>
+                <w:b w:val="0"/>
+                <w:sz w:val="18"/>
+              </w:rPr>
+              <w:t>45 min</w:t>
+            </w:r>
+          </w:p>
+        </w:tc>
+        <w:tc>
+          <w:tcPr>
+            <w:tcW w:type="dxa" w:w="6624"/>
+            <w:vAlign w:val="top"/>
+          </w:tcPr>
+          <w:p>
+            <w:r/>
+            <w:r>
+              <w:rPr>
+                <w:b w:val="0"/>
+                <w:sz w:val="18"/>
+              </w:rPr>
+              <w:t>Use TaskGroups and dynamic task mapping to validate multiple sources and analyze categories.</w:t>
+            </w:r>
+          </w:p>
+        </w:tc>
+      </w:tr>
+    </w:tbl>
+    <w:p/>
+    <w:p>
+      <w:r>
+        <w:t>Run</w:t>
+      </w:r>
+    </w:p>
+    <w:p>
+      <w:pPr>
+        <w:pStyle w:val="NoSpacing"/>
+        <w:spacing w:after="120"/>
+      </w:pPr>
+      <w:r>
+        <w:rPr>
+          <w:rFonts w:ascii="Courier New" w:hAnsi="Courier New" w:eastAsia="Courier New"/>
+          <w:color w:val="232323"/>
+          <w:sz w:val="17"/>
+        </w:rPr>
+        <w:t>docker compose exec airflow-web airflow dags trigger 06_dynamic_dags</w:t>
+      </w:r>
+    </w:p>
+    <w:p>
+      <w:r>
+        <w:t>Student Tasks</w:t>
+      </w:r>
+    </w:p>
+    <w:p>
+      <w:pPr>
+        <w:pStyle w:val="ListNumber"/>
+      </w:pPr>
+      <w:r>
+        <w:t>Expand validate_sources in Graph view and inspect the mapped check_file task instances.</w:t>
+      </w:r>
+    </w:p>
+    <w:p>
+      <w:pPr>
+        <w:pStyle w:val="ListNumber"/>
+      </w:pPr>
+      <w:r>
+        <w:t>Open data_quality and compare Bronze, Silver and Gold checks.</w:t>
+      </w:r>
+    </w:p>
+    <w:p>
+      <w:pPr>
+        <w:pStyle w:val="ListNumber"/>
+      </w:pPr>
+      <w:r>
+        <w:t>Inspect analyze_category mapped tasks for Electronics, Office and Stationery.</w:t>
+      </w:r>
+    </w:p>
+    <w:p>
+      <w:pPr>
+        <w:pStyle w:val="ListNumber"/>
+      </w:pPr>
+      <w:r>
+        <w:t>Review aggregate_analyses output in the logs.</w:t>
+      </w:r>
+    </w:p>
+    <w:p>
+      <w:r>
+        <w:t>Challenge</w:t>
+      </w:r>
+    </w:p>
+    <w:p>
+      <w:pPr>
+        <w:pStyle w:val="ListBullet"/>
+      </w:pPr>
+      <w:r>
+        <w:t>Add a TaskGroup that prints one category summary message per category.</w:t>
+      </w:r>
+    </w:p>
+    <w:p>
+      <w:pPr>
+        <w:pStyle w:val="Heading2"/>
+      </w:pPr>
+      <w:r>
+        <w:t>Lab 7: Apache Hop Integration</w:t>
+      </w:r>
+    </w:p>
+    <w:tbl>
+      <w:tblPr>
+        <w:tblStyle w:val="TableGrid"/>
+        <w:tblW w:type="auto" w:w="0"/>
+        <w:jc w:val="center"/>
+        <w:tblLook w:firstColumn="1" w:firstRow="1" w:lastColumn="0" w:lastRow="0" w:noHBand="0" w:noVBand="1" w:val="04A0"/>
+      </w:tblPr>
+      <w:tblGrid>
+        <w:gridCol w:w="3408"/>
+        <w:gridCol w:w="3408"/>
+        <w:gridCol w:w="3408"/>
+      </w:tblGrid>
+      <w:tr>
+        <w:tc>
+          <w:tcPr>
+            <w:tcW w:type="dxa" w:w="2592"/>
+            <w:vAlign w:val="top"/>
+            <w:shd w:fill="1F4E79"/>
+          </w:tcPr>
+          <w:p>
+            <w:r/>
+            <w:r>
+              <w:rPr>
+                <w:b/>
+                <w:color w:val="FFFFFF"/>
+                <w:sz w:val="18"/>
+              </w:rPr>
+              <w:t>DAG</w:t>
+            </w:r>
+          </w:p>
+        </w:tc>
+        <w:tc>
+          <w:tcPr>
+            <w:tcW w:type="dxa" w:w="1440"/>
+            <w:vAlign w:val="top"/>
+            <w:shd w:fill="1F4E79"/>
+          </w:tcPr>
+          <w:p>
+            <w:r/>
+            <w:r>
+              <w:rPr>
+                <w:b/>
+                <w:color w:val="FFFFFF"/>
+                <w:sz w:val="18"/>
+              </w:rPr>
+              <w:t>Time</w:t>
+            </w:r>
+          </w:p>
+        </w:tc>
+        <w:tc>
+          <w:tcPr>
+            <w:tcW w:type="dxa" w:w="6624"/>
+            <w:vAlign w:val="top"/>
+            <w:shd w:fill="1F4E79"/>
+          </w:tcPr>
+          <w:p>
+            <w:r/>
+            <w:r>
+              <w:rPr>
+                <w:b/>
+                <w:color w:val="FFFFFF"/>
+                <w:sz w:val="18"/>
+              </w:rPr>
+              <w:t>Purpose</w:t>
+            </w:r>
+          </w:p>
+        </w:tc>
+      </w:tr>
+      <w:tr>
+        <w:tc>
+          <w:tcPr>
+            <w:tcW w:type="dxa" w:w="2592"/>
+            <w:vAlign w:val="top"/>
+          </w:tcPr>
+          <w:p>
+            <w:r/>
+            <w:r>
+              <w:rPr>
+                <w:b w:val="0"/>
+                <w:sz w:val="18"/>
+              </w:rPr>
+              <w:t>07_hop_integration</w:t>
+            </w:r>
+          </w:p>
+        </w:tc>
+        <w:tc>
+          <w:tcPr>
+            <w:tcW w:type="dxa" w:w="1440"/>
+            <w:vAlign w:val="top"/>
+          </w:tcPr>
+          <w:p>
+            <w:r/>
+            <w:r>
+              <w:rPr>
+                <w:b w:val="0"/>
+                <w:sz w:val="18"/>
+              </w:rPr>
+              <w:t>60 min</w:t>
+            </w:r>
+          </w:p>
+        </w:tc>
+        <w:tc>
+          <w:tcPr>
+            <w:tcW w:type="dxa" w:w="6624"/>
+            <w:vAlign w:val="top"/>
+          </w:tcPr>
+          <w:p>
+            <w:r/>
+            <w:r>
+              <w:rPr>
+                <w:b w:val="0"/>
+                <w:sz w:val="18"/>
+              </w:rPr>
+              <w:t>Explore how Airflow can orchestrate Hop pipelines through Docker commands, Python helpers and hybrid validation tasks.</w:t>
+            </w:r>
+          </w:p>
+        </w:tc>
+      </w:tr>
+    </w:tbl>
+    <w:p/>
+    <w:p>
+      <w:r>
+        <w:t>Run</w:t>
+      </w:r>
+    </w:p>
+    <w:p>
+      <w:pPr>
+        <w:pStyle w:val="NoSpacing"/>
+        <w:spacing w:after="120"/>
+      </w:pPr>
+      <w:r>
+        <w:rPr>
+          <w:rFonts w:ascii="Courier New" w:hAnsi="Courier New" w:eastAsia="Courier New"/>
+          <w:color w:val="232323"/>
+          <w:sz w:val="17"/>
+        </w:rPr>
+        <w:t>docker compose exec airflow-web airflow dags trigger 07_hop_integration</w:t>
+      </w:r>
+    </w:p>
+    <w:p>
+      <w:r>
+        <w:t>Student Tasks</w:t>
+      </w:r>
+    </w:p>
+    <w:p>
+      <w:pPr>
+        <w:pStyle w:val="ListNumber"/>
+      </w:pPr>
+      <w:r>
+        <w:t>Open Hop Web at http://localhost:8082 and inspect pipelines/bronze_csv_ingest.hpl.</w:t>
+      </w:r>
+    </w:p>
+    <w:p>
+      <w:pPr>
+        <w:pStyle w:val="ListNumber"/>
+      </w:pPr>
+      <w:r>
+        <w:t>Inspect silver_transform.hpl, gold_aggregation.hpl and workflows/day8_medallion_batch.hwf.</w:t>
+      </w:r>
+    </w:p>
+    <w:p>
+      <w:pPr>
+        <w:pStyle w:val="ListNumber"/>
+      </w:pPr>
+      <w:r>
+        <w:t>Trigger 07_hop_integration and compare the three TaskGroups: hop_via_docker_exec, hop_via_python and hybrid_approach.</w:t>
+      </w:r>
+    </w:p>
+    <w:p>
+      <w:pPr>
+        <w:pStyle w:val="ListNumber"/>
+      </w:pPr>
+      <w:r>
+        <w:t>Remember that the Airflow Hop tasks are simulated by default unless the Hop CLI profile and docker exec commands are enabled.</w:t>
+      </w:r>
+    </w:p>
+    <w:p>
+      <w:r>
+        <w:t>Challenge</w:t>
+      </w:r>
+    </w:p>
+    <w:p>
+      <w:pPr>
+        <w:pStyle w:val="ListBullet"/>
+      </w:pPr>
+      <w:r>
+        <w:t>Create or sketch a Hop pipeline that reads products.csv and writes a bronze_products table.</w:t>
+      </w:r>
+    </w:p>
+    <w:p>
+      <w:pPr>
+        <w:pStyle w:val="Heading2"/>
+      </w:pPr>
+      <w:r>
+        <w:t>Lab 8: Kafka Integration</w:t>
+      </w:r>
+    </w:p>
+    <w:tbl>
+      <w:tblPr>
+        <w:tblStyle w:val="TableGrid"/>
+        <w:tblW w:type="auto" w:w="0"/>
+        <w:jc w:val="center"/>
+        <w:tblLook w:firstColumn="1" w:firstRow="1" w:lastColumn="0" w:lastRow="0" w:noHBand="0" w:noVBand="1" w:val="04A0"/>
+      </w:tblPr>
+      <w:tblGrid>
+        <w:gridCol w:w="3408"/>
+        <w:gridCol w:w="3408"/>
+        <w:gridCol w:w="3408"/>
+      </w:tblGrid>
+      <w:tr>
+        <w:tc>
+          <w:tcPr>
+            <w:tcW w:type="dxa" w:w="2592"/>
+            <w:vAlign w:val="top"/>
+            <w:shd w:fill="1F4E79"/>
+          </w:tcPr>
+          <w:p>
+            <w:r/>
+            <w:r>
+              <w:rPr>
+                <w:b/>
+                <w:color w:val="FFFFFF"/>
+                <w:sz w:val="18"/>
+              </w:rPr>
+              <w:t>DAG</w:t>
+            </w:r>
+          </w:p>
+        </w:tc>
+        <w:tc>
+          <w:tcPr>
+            <w:tcW w:type="dxa" w:w="1440"/>
+            <w:vAlign w:val="top"/>
+            <w:shd w:fill="1F4E79"/>
+          </w:tcPr>
+          <w:p>
+            <w:r/>
+            <w:r>
+              <w:rPr>
+                <w:b/>
+                <w:color w:val="FFFFFF"/>
+                <w:sz w:val="18"/>
+              </w:rPr>
+              <w:t>Time</w:t>
+            </w:r>
+          </w:p>
+        </w:tc>
+        <w:tc>
+          <w:tcPr>
+            <w:tcW w:type="dxa" w:w="6624"/>
+            <w:vAlign w:val="top"/>
+            <w:shd w:fill="1F4E79"/>
+          </w:tcPr>
+          <w:p>
+            <w:r/>
+            <w:r>
+              <w:rPr>
+                <w:b/>
+                <w:color w:val="FFFFFF"/>
+                <w:sz w:val="18"/>
+              </w:rPr>
+              <w:t>Purpose</w:t>
+            </w:r>
+          </w:p>
+        </w:tc>
+      </w:tr>
+      <w:tr>
+        <w:tc>
+          <w:tcPr>
+            <w:tcW w:type="dxa" w:w="2592"/>
+            <w:vAlign w:val="top"/>
+          </w:tcPr>
+          <w:p>
+            <w:r/>
+            <w:r>
+              <w:rPr>
+                <w:b w:val="0"/>
+                <w:sz w:val="18"/>
+              </w:rPr>
+              <w:t>08_kafka_consumer_pipeline</w:t>
+            </w:r>
+          </w:p>
+        </w:tc>
+        <w:tc>
+          <w:tcPr>
+            <w:tcW w:type="dxa" w:w="1440"/>
+            <w:vAlign w:val="top"/>
+          </w:tcPr>
+          <w:p>
+            <w:r/>
+            <w:r>
+              <w:rPr>
+                <w:b w:val="0"/>
+                <w:sz w:val="18"/>
+              </w:rPr>
+              <w:t>60 min</w:t>
+            </w:r>
+          </w:p>
+        </w:tc>
+        <w:tc>
+          <w:tcPr>
+            <w:tcW w:type="dxa" w:w="6624"/>
+            <w:vAlign w:val="top"/>
+          </w:tcPr>
+          <w:p>
+            <w:r/>
+            <w:r>
+              <w:rPr>
+                <w:b w:val="0"/>
+                <w:sz w:val="18"/>
+              </w:rPr>
+              <w:t>Generate Kafka order events, consume them in Airflow as a micro-batch, land raw events in Bronze and update Silver orders.</w:t>
+            </w:r>
+          </w:p>
+        </w:tc>
+      </w:tr>
+    </w:tbl>
+    <w:p/>
+    <w:p>
+      <w:r>
+        <w:t>Run</w:t>
+      </w:r>
+    </w:p>
+    <w:p>
+      <w:pPr>
+        <w:pStyle w:val="NoSpacing"/>
+        <w:spacing w:after="120"/>
+      </w:pPr>
+      <w:r>
+        <w:rPr>
+          <w:rFonts w:ascii="Courier New" w:hAnsi="Courier New" w:eastAsia="Courier New"/>
+          <w:color w:val="232323"/>
+          <w:sz w:val="17"/>
+        </w:rPr>
+        <w:t>docker compose exec airflow-web python /opt/airflow/scripts/kafka_producer.py --count 20</w:t>
+      </w:r>
+      <w:r>
+        <w:br/>
+      </w:r>
+      <w:r>
+        <w:rPr>
+          <w:rFonts w:ascii="Courier New" w:hAnsi="Courier New" w:eastAsia="Courier New"/>
+          <w:color w:val="232323"/>
+          <w:sz w:val="17"/>
+        </w:rPr>
+        <w:t>docker compose exec airflow-web airflow dags trigger 08_kafka_consumer_pipeline</w:t>
+      </w:r>
+      <w:r>
+        <w:br/>
+      </w:r>
+      <w:r>
+        <w:rPr>
+          <w:rFonts w:ascii="Courier New" w:hAnsi="Courier New" w:eastAsia="Courier New"/>
+          <w:color w:val="232323"/>
+          <w:sz w:val="17"/>
+        </w:rPr>
+        <w:t>docker compose exec postgres psql -U airflow -d airflow -c "SELECT COUNT(*) AS kafka_events FROM bronze_kafka_events;"</w:t>
+      </w:r>
+      <w:r>
+        <w:br/>
+      </w:r>
+      <w:r>
+        <w:rPr>
+          <w:rFonts w:ascii="Courier New" w:hAnsi="Courier New" w:eastAsia="Courier New"/>
+          <w:color w:val="232323"/>
+          <w:sz w:val="17"/>
+        </w:rPr>
+        <w:t>docker compose exec postgres psql -U airflow -d airflow -c "SELECT COUNT(*) AS silver_orders FROM silver_orders;"</w:t>
+      </w:r>
+    </w:p>
+    <w:p>
+      <w:r>
+        <w:t>Student Tasks</w:t>
+      </w:r>
+    </w:p>
+    <w:p>
+      <w:pPr>
+        <w:pStyle w:val="ListNumber"/>
+      </w:pPr>
+      <w:r>
+        <w:t>Open Kafka UI at http://localhost:8081 and inspect topic orders.raw.</w:t>
+      </w:r>
+    </w:p>
+    <w:p>
+      <w:pPr>
+        <w:pStyle w:val="ListNumber"/>
+      </w:pPr>
+      <w:r>
+        <w:t>Run the producer and confirm messages appear in Kafka UI.</w:t>
+      </w:r>
+    </w:p>
+    <w:p>
+      <w:pPr>
+        <w:pStyle w:val="ListNumber"/>
+      </w:pPr>
+      <w:r>
+        <w:t>Trigger 08_kafka_consumer_pipeline and review check_kafka_health, consume_kafka_batch, write_to_bronze and transform_kafka_to_silver.</w:t>
+      </w:r>
+    </w:p>
+    <w:p>
+      <w:pPr>
+        <w:pStyle w:val="ListNumber"/>
+      </w:pPr>
+      <w:r>
+        <w:t>Query bronze_kafka_events and confirm raw JSON payloads are preserved.</w:t>
+      </w:r>
+    </w:p>
+    <w:p>
+      <w:r>
+        <w:t>Challenge</w:t>
+      </w:r>
+    </w:p>
+    <w:p>
+      <w:pPr>
+        <w:pStyle w:val="ListBullet"/>
+      </w:pPr>
+      <w:r>
+        <w:t>Modify kafka_producer.py to add a priority field, then filter high-priority events during the Silver transform.</w:t>
+      </w:r>
+    </w:p>
+    <w:p>
+      <w:pPr>
+        <w:pStyle w:val="Heading2"/>
+      </w:pPr>
+      <w:r>
+        <w:t>Lab 9: Full End-To-End Orchestration</w:t>
+      </w:r>
+    </w:p>
+    <w:tbl>
+      <w:tblPr>
+        <w:tblStyle w:val="TableGrid"/>
+        <w:tblW w:type="auto" w:w="0"/>
+        <w:jc w:val="center"/>
+        <w:tblLook w:firstColumn="1" w:firstRow="1" w:lastColumn="0" w:lastRow="0" w:noHBand="0" w:noVBand="1" w:val="04A0"/>
+      </w:tblPr>
+      <w:tblGrid>
+        <w:gridCol w:w="3408"/>
+        <w:gridCol w:w="3408"/>
+        <w:gridCol w:w="3408"/>
+      </w:tblGrid>
+      <w:tr>
+        <w:tc>
+          <w:tcPr>
+            <w:tcW w:type="dxa" w:w="2592"/>
+            <w:vAlign w:val="top"/>
+            <w:shd w:fill="1F4E79"/>
+          </w:tcPr>
+          <w:p>
+            <w:r/>
+            <w:r>
+              <w:rPr>
+                <w:b/>
+                <w:color w:val="FFFFFF"/>
+                <w:sz w:val="18"/>
+              </w:rPr>
+              <w:t>DAG</w:t>
+            </w:r>
+          </w:p>
+        </w:tc>
+        <w:tc>
+          <w:tcPr>
+            <w:tcW w:type="dxa" w:w="1440"/>
+            <w:vAlign w:val="top"/>
+            <w:shd w:fill="1F4E79"/>
+          </w:tcPr>
+          <w:p>
+            <w:r/>
+            <w:r>
+              <w:rPr>
+                <w:b/>
+                <w:color w:val="FFFFFF"/>
+                <w:sz w:val="18"/>
+              </w:rPr>
+              <w:t>Time</w:t>
+            </w:r>
+          </w:p>
+        </w:tc>
+        <w:tc>
+          <w:tcPr>
+            <w:tcW w:type="dxa" w:w="6624"/>
+            <w:vAlign w:val="top"/>
+            <w:shd w:fill="1F4E79"/>
+          </w:tcPr>
+          <w:p>
+            <w:r/>
+            <w:r>
+              <w:rPr>
+                <w:b/>
+                <w:color w:val="FFFFFF"/>
+                <w:sz w:val="18"/>
+              </w:rPr>
+              <w:t>Purpose</w:t>
+            </w:r>
+          </w:p>
+        </w:tc>
+      </w:tr>
+      <w:tr>
+        <w:tc>
+          <w:tcPr>
+            <w:tcW w:type="dxa" w:w="2592"/>
+            <w:vAlign w:val="top"/>
+          </w:tcPr>
+          <w:p>
+            <w:r/>
+            <w:r>
+              <w:rPr>
+                <w:b w:val="0"/>
+                <w:sz w:val="18"/>
+              </w:rPr>
+              <w:t>09_full_orchestration</w:t>
+            </w:r>
+          </w:p>
+        </w:tc>
+        <w:tc>
+          <w:tcPr>
+            <w:tcW w:type="dxa" w:w="1440"/>
+            <w:vAlign w:val="top"/>
+          </w:tcPr>
+          <w:p>
+            <w:r/>
+            <w:r>
+              <w:rPr>
+                <w:b w:val="0"/>
+                <w:sz w:val="18"/>
+              </w:rPr>
+              <w:t>60 min</w:t>
+            </w:r>
+          </w:p>
+        </w:tc>
+        <w:tc>
+          <w:tcPr>
+            <w:tcW w:type="dxa" w:w="6624"/>
+            <w:vAlign w:val="top"/>
+          </w:tcPr>
+          <w:p>
+            <w:r/>
+            <w:r>
+              <w:rPr>
+                <w:b w:val="0"/>
+                <w:sz w:val="18"/>
+              </w:rPr>
+              <w:t>Run the capstone DAG that combines CSV ingestion, Kafka ingestion, data quality gates, Silver transforms, Gold builds and executive reporting.</w:t>
+            </w:r>
+          </w:p>
+        </w:tc>
+      </w:tr>
+    </w:tbl>
+    <w:p/>
+    <w:p>
+      <w:r>
+        <w:t>Run</w:t>
+      </w:r>
+    </w:p>
+    <w:p>
+      <w:pPr>
+        <w:pStyle w:val="NoSpacing"/>
+        <w:spacing w:after="120"/>
+      </w:pPr>
+      <w:r>
+        <w:rPr>
+          <w:rFonts w:ascii="Courier New" w:hAnsi="Courier New" w:eastAsia="Courier New"/>
+          <w:color w:val="232323"/>
+          <w:sz w:val="17"/>
+        </w:rPr>
+        <w:t>docker compose exec airflow-web python /opt/airflow/scripts/kafka_producer.py --count 20</w:t>
+      </w:r>
+      <w:r>
+        <w:br/>
+      </w:r>
+      <w:r>
+        <w:rPr>
+          <w:rFonts w:ascii="Courier New" w:hAnsi="Courier New" w:eastAsia="Courier New"/>
+          <w:color w:val="232323"/>
+          <w:sz w:val="17"/>
+        </w:rPr>
+        <w:t>docker compose exec airflow-web airflow dags trigger 09_full_orchestration</w:t>
+      </w:r>
+      <w:r>
+        <w:br/>
+      </w:r>
+      <w:r>
+        <w:rPr>
+          <w:rFonts w:ascii="Courier New" w:hAnsi="Courier New" w:eastAsia="Courier New"/>
+          <w:color w:val="232323"/>
+          <w:sz w:val="17"/>
+        </w:rPr>
+        <w:t>docker compose exec postgres psql -U airflow -d airflow -c "SELECT * FROM data_quality_results ORDER BY checked_at DESC LIMIT 10;"</w:t>
+      </w:r>
+      <w:r>
+        <w:br/>
+      </w:r>
+      <w:r>
+        <w:rPr>
+          <w:rFonts w:ascii="Courier New" w:hAnsi="Courier New" w:eastAsia="Courier New"/>
+          <w:color w:val="232323"/>
+          <w:sz w:val="17"/>
+        </w:rPr>
+        <w:t>docker compose exec postgres psql -U airflow -d airflow -c "SELECT COUNT(*) FROM gold_product_performance;"</w:t>
+      </w:r>
+    </w:p>
+    <w:p>
+      <w:r>
+        <w:t>Student Tasks</w:t>
+      </w:r>
+    </w:p>
+    <w:p>
+      <w:pPr>
+        <w:pStyle w:val="ListNumber"/>
+      </w:pPr>
+      <w:r>
+        <w:t>Watch the DAG move through phase1_ingestion, phase2_quality_gate, phase3_silver_transform, phase4_gold_build and generate_executive_summary.</w:t>
+      </w:r>
+    </w:p>
+    <w:p>
+      <w:pPr>
+        <w:pStyle w:val="ListNumber"/>
+      </w:pPr>
+      <w:r>
+        <w:t>Review quality gate rows in data_quality_results.</w:t>
+      </w:r>
+    </w:p>
+    <w:p>
+      <w:pPr>
+        <w:pStyle w:val="ListNumber"/>
+      </w:pPr>
+      <w:r>
+        <w:t>Open the generate_executive_summary task log and record Bronze, Silver and Gold counts.</w:t>
+      </w:r>
+    </w:p>
+    <w:p>
+      <w:pPr>
+        <w:pStyle w:val="ListNumber"/>
+      </w:pPr>
+      <w:r>
+        <w:t>Compare the capstone DAG with the smaller lab DAGs it builds on.</w:t>
+      </w:r>
+    </w:p>
+    <w:p>
+      <w:r>
+        <w:t>Challenge</w:t>
+      </w:r>
+    </w:p>
+    <w:p>
+      <w:pPr>
+        <w:pStyle w:val="ListBullet"/>
+      </w:pPr>
+      <w:r>
+        <w:t>Add a sixth phase that exports Gold tables to CSV files under an output folder.</w:t>
+      </w:r>
+    </w:p>
+    <w:p>
+      <w:pPr>
+        <w:pStyle w:val="Heading2"/>
+      </w:pPr>
+      <w:r>
+        <w:t>Lab 10: Advanced Production Patterns</w:t>
+      </w:r>
+    </w:p>
+    <w:tbl>
+      <w:tblPr>
+        <w:tblStyle w:val="TableGrid"/>
+        <w:tblW w:type="auto" w:w="0"/>
+        <w:jc w:val="center"/>
+        <w:tblLook w:firstColumn="1" w:firstRow="1" w:lastColumn="0" w:lastRow="0" w:noHBand="0" w:noVBand="1" w:val="04A0"/>
+      </w:tblPr>
+      <w:tblGrid>
+        <w:gridCol w:w="3408"/>
+        <w:gridCol w:w="3408"/>
+        <w:gridCol w:w="3408"/>
+      </w:tblGrid>
+      <w:tr>
+        <w:tc>
+          <w:tcPr>
+            <w:tcW w:type="dxa" w:w="2592"/>
+            <w:vAlign w:val="top"/>
+            <w:shd w:fill="1F4E79"/>
+          </w:tcPr>
+          <w:p>
+            <w:r/>
+            <w:r>
+              <w:rPr>
+                <w:b/>
+                <w:color w:val="FFFFFF"/>
+                <w:sz w:val="18"/>
+              </w:rPr>
+              <w:t>DAG</w:t>
+            </w:r>
+          </w:p>
+        </w:tc>
+        <w:tc>
+          <w:tcPr>
+            <w:tcW w:type="dxa" w:w="1440"/>
+            <w:vAlign w:val="top"/>
+            <w:shd w:fill="1F4E79"/>
+          </w:tcPr>
+          <w:p>
+            <w:r/>
+            <w:r>
+              <w:rPr>
+                <w:b/>
+                <w:color w:val="FFFFFF"/>
+                <w:sz w:val="18"/>
+              </w:rPr>
+              <w:t>Time</w:t>
+            </w:r>
+          </w:p>
+        </w:tc>
+        <w:tc>
+          <w:tcPr>
+            <w:tcW w:type="dxa" w:w="6624"/>
+            <w:vAlign w:val="top"/>
+            <w:shd w:fill="1F4E79"/>
+          </w:tcPr>
+          <w:p>
+            <w:r/>
+            <w:r>
+              <w:rPr>
+                <w:b/>
+                <w:color w:val="FFFFFF"/>
+                <w:sz w:val="18"/>
+              </w:rPr>
+              <w:t>Purpose</w:t>
+            </w:r>
+          </w:p>
+        </w:tc>
+      </w:tr>
+      <w:tr>
+        <w:tc>
+          <w:tcPr>
+            <w:tcW w:type="dxa" w:w="2592"/>
+            <w:vAlign w:val="top"/>
+          </w:tcPr>
+          <w:p>
+            <w:r/>
+            <w:r>
+              <w:rPr>
+                <w:b w:val="0"/>
+                <w:sz w:val="18"/>
+              </w:rPr>
+              <w:t>10_advanced_patterns</w:t>
+            </w:r>
+          </w:p>
+        </w:tc>
+        <w:tc>
+          <w:tcPr>
+            <w:tcW w:type="dxa" w:w="1440"/>
+            <w:vAlign w:val="top"/>
+          </w:tcPr>
+          <w:p>
+            <w:r/>
+            <w:r>
+              <w:rPr>
+                <w:b w:val="0"/>
+                <w:sz w:val="18"/>
+              </w:rPr>
+              <w:t>45 min</w:t>
+            </w:r>
+          </w:p>
+        </w:tc>
+        <w:tc>
+          <w:tcPr>
+            <w:tcW w:type="dxa" w:w="6624"/>
+            <w:vAlign w:val="top"/>
+          </w:tcPr>
+          <w:p>
+            <w:r/>
+            <w:r>
+              <w:rPr>
+                <w:b w:val="0"/>
+                <w:sz w:val="18"/>
+              </w:rPr>
+              <w:t>Practice Airflow Variables, idempotent upserts, custom callbacks, data-driven branching, TriggerDagRunOperator and monitoring checks.</w:t>
+            </w:r>
+          </w:p>
+        </w:tc>
+      </w:tr>
+    </w:tbl>
+    <w:p/>
+    <w:p>
+      <w:r>
+        <w:t>Run</w:t>
+      </w:r>
+    </w:p>
+    <w:p>
+      <w:pPr>
+        <w:pStyle w:val="NoSpacing"/>
+        <w:spacing w:after="120"/>
+      </w:pPr>
+      <w:r>
+        <w:rPr>
+          <w:rFonts w:ascii="Courier New" w:hAnsi="Courier New" w:eastAsia="Courier New"/>
+          <w:color w:val="232323"/>
+          <w:sz w:val="17"/>
+        </w:rPr>
+        <w:t>docker compose exec airflow-web airflow dags trigger 10_advanced_patterns</w:t>
+      </w:r>
+      <w:r>
+        <w:br/>
+      </w:r>
+      <w:r>
+        <w:rPr>
+          <w:rFonts w:ascii="Courier New" w:hAnsi="Courier New" w:eastAsia="Courier New"/>
+          <w:color w:val="232323"/>
+          <w:sz w:val="17"/>
+        </w:rPr>
+        <w:t>docker compose exec postgres psql -U airflow -d airflow -c "SELECT * FROM pipeline_summary ORDER BY summary_date DESC;"</w:t>
+      </w:r>
+    </w:p>
+    <w:p>
+      <w:r>
+        <w:t>Student Tasks</w:t>
+      </w:r>
+    </w:p>
+    <w:p>
+      <w:pPr>
+        <w:pStyle w:val="ListNumber"/>
+      </w:pPr>
+      <w:r>
+        <w:t>Open Admin -&gt; Variables and confirm kafka_broker, kafka_orders_topic, hop_project_folder and data_quality_threshold.</w:t>
+      </w:r>
+    </w:p>
+    <w:p>
+      <w:pPr>
+        <w:pStyle w:val="ListNumber"/>
+      </w:pPr>
+      <w:r>
+        <w:t>Run the DAG twice and confirm pipeline_summary keeps exactly one row per date.</w:t>
+      </w:r>
+    </w:p>
+    <w:p>
+      <w:pPr>
+        <w:pStyle w:val="ListNumber"/>
+      </w:pPr>
+      <w:r>
+        <w:t>Review callback messages in task logs.</w:t>
+      </w:r>
+    </w:p>
+    <w:p>
+      <w:pPr>
+        <w:pStyle w:val="ListNumber"/>
+      </w:pPr>
+      <w:r>
+        <w:t>Observe trigger_medallion_pipeline and confirm it points to 03_medallion_pipeline.</w:t>
+      </w:r>
+    </w:p>
+    <w:p>
+      <w:pPr>
+        <w:pStyle w:val="ListNumber"/>
+      </w:pPr>
+      <w:r>
+        <w:t>Inspect monitoring logs for freshness, table counts and quality pass rate.</w:t>
+      </w:r>
+    </w:p>
+    <w:p>
+      <w:r>
+        <w:t>Challenge</w:t>
+      </w:r>
+    </w:p>
+    <w:p>
+      <w:pPr>
+        <w:pStyle w:val="ListBullet"/>
+      </w:pPr>
+      <w:r>
+        <w:t>Add a custom callback that writes alert records to a pipeline_alerts table.</w:t>
       </w:r>
     </w:p>
     <w:p>
@@ -967,41 +3960,354 @@
         <w:pStyle w:val="Heading1"/>
       </w:pPr>
       <w:r>
-        <w:t>Mini Exercises</w:t>
+        <w:t>Validation Checklist</w:t>
       </w:r>
     </w:p>
     <w:p>
       <w:pPr>
-        <w:pStyle w:val="ListNumber"/>
+        <w:pStyle w:val="ListBullet"/>
       </w:pPr>
       <w:r>
-        <w:t>Add a row with quantity=0, rerun, and explain why it appears in Bronze but not Silver.</w:t>
+        <w:t>Airflow UI opens at http://localhost:8080 and shows the ten Day 8 DAGs.</w:t>
       </w:r>
     </w:p>
     <w:p>
       <w:pPr>
-        <w:pStyle w:val="ListNumber"/>
+        <w:pStyle w:val="ListBullet"/>
       </w:pPr>
       <w:r>
-        <w:t>Rerun without changing the CSV. Notice Bronze appends while Silver and Gold replace their tables.</w:t>
+        <w:t>The setup check script reports OK for PostgreSQL, Airflow WebUI, Kafka, Hop Web UI, Kafka UI and data files.</w:t>
       </w:r>
     </w:p>
     <w:p>
       <w:pPr>
-        <w:pStyle w:val="ListNumber"/>
+        <w:pStyle w:val="ListBullet"/>
       </w:pPr>
       <w:r>
-        <w:t>Propose an idempotency improvement: file audit table, checksum, processed-file archive, or upsert logic.</w:t>
+        <w:t>Lab 3 populates Bronze, Silver and Gold tables from CSV data.</w:t>
       </w:r>
     </w:p>
     <w:p>
       <w:pPr>
-        <w:pStyle w:val="ListNumber"/>
+        <w:pStyle w:val="ListBullet"/>
       </w:pPr>
       <w:r>
-        <w:t>Explain why Airflow orchestrates the tasks but does not guarantee transformation correctness by itself.</w:t>
+        <w:t>Lab 8 can produce Kafka events and load them into bronze_kafka_events.</w:t>
       </w:r>
     </w:p>
+    <w:p>
+      <w:pPr>
+        <w:pStyle w:val="ListBullet"/>
+      </w:pPr>
+      <w:r>
+        <w:t>Lab 9 writes data_quality_results and prints an executive summary.</w:t>
+      </w:r>
+    </w:p>
+    <w:p>
+      <w:pPr>
+        <w:pStyle w:val="ListBullet"/>
+      </w:pPr>
+      <w:r>
+        <w:t>Lab 10 writes or updates one pipeline_summary row for the current date.</w:t>
+      </w:r>
+    </w:p>
+    <w:p>
+      <w:pPr>
+        <w:pStyle w:val="Heading1"/>
+      </w:pPr>
+      <w:r>
+        <w:t>Troubleshooting</w:t>
+      </w:r>
+    </w:p>
+    <w:tbl>
+      <w:tblPr>
+        <w:tblStyle w:val="TableGrid"/>
+        <w:tblW w:type="auto" w:w="0"/>
+        <w:jc w:val="center"/>
+        <w:tblLook w:firstColumn="1" w:firstRow="1" w:lastColumn="0" w:lastRow="0" w:noHBand="0" w:noVBand="1" w:val="04A0"/>
+      </w:tblPr>
+      <w:tblGrid>
+        <w:gridCol w:w="5112"/>
+        <w:gridCol w:w="5112"/>
+      </w:tblGrid>
+      <w:tr>
+        <w:tc>
+          <w:tcPr>
+            <w:tcW w:type="dxa" w:w="5112"/>
+            <w:vAlign w:val="top"/>
+            <w:shd w:fill="1F4E79"/>
+          </w:tcPr>
+          <w:p>
+            <w:r/>
+            <w:r>
+              <w:rPr>
+                <w:b/>
+                <w:color w:val="FFFFFF"/>
+                <w:sz w:val="18"/>
+              </w:rPr>
+              <w:t>Issue</w:t>
+            </w:r>
+          </w:p>
+        </w:tc>
+        <w:tc>
+          <w:tcPr>
+            <w:tcW w:type="dxa" w:w="5112"/>
+            <w:vAlign w:val="top"/>
+            <w:shd w:fill="1F4E79"/>
+          </w:tcPr>
+          <w:p>
+            <w:r/>
+            <w:r>
+              <w:rPr>
+                <w:b/>
+                <w:color w:val="FFFFFF"/>
+                <w:sz w:val="18"/>
+              </w:rPr>
+              <w:t>Likely fix</w:t>
+            </w:r>
+          </w:p>
+        </w:tc>
+      </w:tr>
+      <w:tr>
+        <w:tc>
+          <w:tcPr>
+            <w:tcW w:type="dxa" w:w="5112"/>
+            <w:vAlign w:val="top"/>
+          </w:tcPr>
+          <w:p>
+            <w:r/>
+            <w:r>
+              <w:rPr>
+                <w:b w:val="0"/>
+                <w:sz w:val="18"/>
+              </w:rPr>
+              <w:t>DAGs do not appear</w:t>
+            </w:r>
+          </w:p>
+        </w:tc>
+        <w:tc>
+          <w:tcPr>
+            <w:tcW w:type="dxa" w:w="5112"/>
+            <w:vAlign w:val="top"/>
+          </w:tcPr>
+          <w:p>
+            <w:r/>
+            <w:r>
+              <w:rPr>
+                <w:b w:val="0"/>
+                <w:sz w:val="18"/>
+              </w:rPr>
+              <w:t>Wait about 30 seconds, then check docker compose logs airflow-sched.</w:t>
+            </w:r>
+          </w:p>
+        </w:tc>
+      </w:tr>
+      <w:tr>
+        <w:tc>
+          <w:tcPr>
+            <w:tcW w:type="dxa" w:w="5112"/>
+            <w:vAlign w:val="top"/>
+          </w:tcPr>
+          <w:p>
+            <w:r/>
+            <w:r>
+              <w:rPr>
+                <w:b w:val="0"/>
+                <w:sz w:val="18"/>
+              </w:rPr>
+              <w:t>Airflow login fails</w:t>
+            </w:r>
+          </w:p>
+        </w:tc>
+        <w:tc>
+          <w:tcPr>
+            <w:tcW w:type="dxa" w:w="5112"/>
+            <w:vAlign w:val="top"/>
+          </w:tcPr>
+          <w:p>
+            <w:r/>
+            <w:r>
+              <w:rPr>
+                <w:b w:val="0"/>
+                <w:sz w:val="18"/>
+              </w:rPr>
+              <w:t>Use admin / admin. The airflow-init service creates this user.</w:t>
+            </w:r>
+          </w:p>
+        </w:tc>
+      </w:tr>
+      <w:tr>
+        <w:tc>
+          <w:tcPr>
+            <w:tcW w:type="dxa" w:w="5112"/>
+            <w:vAlign w:val="top"/>
+          </w:tcPr>
+          <w:p>
+            <w:r/>
+            <w:r>
+              <w:rPr>
+                <w:b w:val="0"/>
+                <w:sz w:val="18"/>
+              </w:rPr>
+              <w:t>FileSensor timeout</w:t>
+            </w:r>
+          </w:p>
+        </w:tc>
+        <w:tc>
+          <w:tcPr>
+            <w:tcW w:type="dxa" w:w="5112"/>
+            <w:vAlign w:val="top"/>
+          </w:tcPr>
+          <w:p>
+            <w:r/>
+            <w:r>
+              <w:rPr>
+                <w:b w:val="0"/>
+                <w:sz w:val="18"/>
+              </w:rPr>
+              <w:t>Confirm Lab_Files/data contains new_orders.csv, customers.csv and products.csv.</w:t>
+            </w:r>
+          </w:p>
+        </w:tc>
+      </w:tr>
+      <w:tr>
+        <w:tc>
+          <w:tcPr>
+            <w:tcW w:type="dxa" w:w="5112"/>
+            <w:vAlign w:val="top"/>
+          </w:tcPr>
+          <w:p>
+            <w:r/>
+            <w:r>
+              <w:rPr>
+                <w:b w:val="0"/>
+                <w:sz w:val="18"/>
+              </w:rPr>
+              <w:t>PostgreSQL query fails</w:t>
+            </w:r>
+          </w:p>
+        </w:tc>
+        <w:tc>
+          <w:tcPr>
+            <w:tcW w:type="dxa" w:w="5112"/>
+            <w:vAlign w:val="top"/>
+          </w:tcPr>
+          <w:p>
+            <w:r/>
+            <w:r>
+              <w:rPr>
+                <w:b w:val="0"/>
+                <w:sz w:val="18"/>
+              </w:rPr>
+              <w:t>Run docker compose ps and confirm day8-postgres is healthy.</w:t>
+            </w:r>
+          </w:p>
+        </w:tc>
+      </w:tr>
+      <w:tr>
+        <w:tc>
+          <w:tcPr>
+            <w:tcW w:type="dxa" w:w="5112"/>
+            <w:vAlign w:val="top"/>
+          </w:tcPr>
+          <w:p>
+            <w:r/>
+            <w:r>
+              <w:rPr>
+                <w:b w:val="0"/>
+                <w:sz w:val="18"/>
+              </w:rPr>
+              <w:t>Kafka producer cannot connect</w:t>
+            </w:r>
+          </w:p>
+        </w:tc>
+        <w:tc>
+          <w:tcPr>
+            <w:tcW w:type="dxa" w:w="5112"/>
+            <w:vAlign w:val="top"/>
+          </w:tcPr>
+          <w:p>
+            <w:r/>
+            <w:r>
+              <w:rPr>
+                <w:b w:val="0"/>
+                <w:sz w:val="18"/>
+              </w:rPr>
+              <w:t>Wait for Kafka health to pass, then check docker compose logs kafka. From Airflow use kafka:29092; from host use localhost:9092.</w:t>
+            </w:r>
+          </w:p>
+        </w:tc>
+      </w:tr>
+      <w:tr>
+        <w:tc>
+          <w:tcPr>
+            <w:tcW w:type="dxa" w:w="5112"/>
+            <w:vAlign w:val="top"/>
+          </w:tcPr>
+          <w:p>
+            <w:r/>
+            <w:r>
+              <w:rPr>
+                <w:b w:val="0"/>
+                <w:sz w:val="18"/>
+              </w:rPr>
+              <w:t>Hop tasks look simulated</w:t>
+            </w:r>
+          </w:p>
+        </w:tc>
+        <w:tc>
+          <w:tcPr>
+            <w:tcW w:type="dxa" w:w="5112"/>
+            <w:vAlign w:val="top"/>
+          </w:tcPr>
+          <w:p>
+            <w:r/>
+            <w:r>
+              <w:rPr>
+                <w:b w:val="0"/>
+                <w:sz w:val="18"/>
+              </w:rPr>
+              <w:t>This is expected in the Airflow DAGs. Use Hop Web for visual inspection, or start the cli profile and enable real docker exec commands for advanced practice.</w:t>
+            </w:r>
+          </w:p>
+        </w:tc>
+      </w:tr>
+      <w:tr>
+        <w:tc>
+          <w:tcPr>
+            <w:tcW w:type="dxa" w:w="5112"/>
+            <w:vAlign w:val="top"/>
+          </w:tcPr>
+          <w:p>
+            <w:r/>
+            <w:r>
+              <w:rPr>
+                <w:b w:val="0"/>
+                <w:sz w:val="18"/>
+              </w:rPr>
+              <w:t>Port conflict on 8080/8081/8082/5432</w:t>
+            </w:r>
+          </w:p>
+        </w:tc>
+        <w:tc>
+          <w:tcPr>
+            <w:tcW w:type="dxa" w:w="5112"/>
+            <w:vAlign w:val="top"/>
+          </w:tcPr>
+          <w:p>
+            <w:r/>
+            <w:r>
+              <w:rPr>
+                <w:b w:val="0"/>
+                <w:sz w:val="18"/>
+              </w:rPr>
+              <w:t>Change the host ports in docker-compose.yml or stop the local service using the conflicting port.</w:t>
+            </w:r>
+          </w:p>
+        </w:tc>
+      </w:tr>
+    </w:tbl>
+    <w:p/>
     <w:p>
       <w:pPr>
         <w:pStyle w:val="Heading1"/>
@@ -1011,25 +4317,41 @@
       </w:r>
     </w:p>
     <w:p>
+      <w:r>
+        <w:t>Stop containers but keep named volumes:</w:t>
+      </w:r>
+    </w:p>
+    <w:p>
       <w:pPr>
-        <w:spacing w:before="80" w:after="160"/>
+        <w:pStyle w:val="NoSpacing"/>
+        <w:spacing w:after="120"/>
       </w:pPr>
       <w:r>
         <w:rPr>
-          <w:rFonts w:ascii="Consolas" w:hAnsi="Consolas" w:eastAsia="Consolas"/>
+          <w:rFonts w:ascii="Courier New" w:hAnsi="Courier New" w:eastAsia="Courier New"/>
+          <w:color w:val="232323"/>
           <w:sz w:val="17"/>
         </w:rPr>
-        <w:t>cd Week_02/Day_08/Lab_Files</w:t>
+        <w:t>docker compose down</w:t>
       </w:r>
+    </w:p>
+    <w:p>
       <w:r>
-        <w:br/>
+        <w:t>Remove containers and PostgreSQL volume for a clean reset:</w:t>
       </w:r>
+    </w:p>
+    <w:p>
+      <w:pPr>
+        <w:pStyle w:val="NoSpacing"/>
+        <w:spacing w:after="120"/>
+      </w:pPr>
       <w:r>
         <w:rPr>
-          <w:rFonts w:ascii="Consolas" w:hAnsi="Consolas" w:eastAsia="Consolas"/>
+          <w:rFonts w:ascii="Courier New" w:hAnsi="Courier New" w:eastAsia="Courier New"/>
+          <w:color w:val="232323"/>
           <w:sz w:val="17"/>
         </w:rPr>
-        <w:t>sudo docker compose down</w:t>
+        <w:t>docker compose down -v</w:t>
       </w:r>
     </w:p>
     <w:p>
@@ -1037,7 +4359,7 @@
         <w:pStyle w:val="Heading1"/>
       </w:pPr>
       <w:r>
-        <w:t>Official References</w:t>
+        <w:t>References For This Lab Package</w:t>
       </w:r>
     </w:p>
     <w:p>
@@ -1045,7 +4367,7 @@
         <w:pStyle w:val="ListBullet"/>
       </w:pPr>
       <w:r>
-        <w:t>Docker Engine on Ubuntu: https://docs.docker.com/engine/install/ubuntu/</w:t>
+        <w:t>Apache Airflow UI and DAG concepts: use the DAG doc_md blocks embedded in Lab_Files/dags/*.py.</w:t>
       </w:r>
     </w:p>
     <w:p>
@@ -1053,7 +4375,7 @@
         <w:pStyle w:val="ListBullet"/>
       </w:pPr>
       <w:r>
-        <w:t>Docker Desktop on Windows: https://docs.docker.com/desktop/setup/install/windows-install/</w:t>
+        <w:t>PostgreSQL schema: Lab_Files/sql/init_warehouse.sql.</w:t>
       </w:r>
     </w:p>
     <w:p>
@@ -1061,7 +4383,7 @@
         <w:pStyle w:val="ListBullet"/>
       </w:pPr>
       <w:r>
-        <w:t>Apache Airflow documentation: https://airflow.apache.org/docs/</w:t>
+        <w:t>Kafka producer details: Lab_Files/scripts/kafka_producer.py.</w:t>
       </w:r>
     </w:p>
     <w:p>
@@ -1069,12 +4391,32 @@
         <w:pStyle w:val="ListBullet"/>
       </w:pPr>
       <w:r>
-        <w:t>Airflow Docker Compose quick start: https://airflow.apache.org/docs/apache-airflow/stable/howto/docker-compose/index.html</w:t>
+        <w:t>Hop visual assets: Lab_Files/hop/pipelines and Lab_Files/hop/workflows.</w:t>
+      </w:r>
+    </w:p>
+    <w:p>
+      <w:pPr>
+        <w:pStyle w:val="ListBullet"/>
+      </w:pPr>
+      <w:r>
+        <w:t>Environment health check: Lab_Files/scripts/verify_setup.py.</w:t>
+      </w:r>
+    </w:p>
+    <w:p>
+      <w:pPr>
+        <w:jc w:val="center"/>
+      </w:pPr>
+      <w:r>
+        <w:rPr>
+          <w:i/>
+          <w:color w:val="5B9BD5"/>
+        </w:rPr>
+        <w:t>End of Day 08 Lab Guide</w:t>
       </w:r>
     </w:p>
     <w:sectPr>
       <w:pgSz w:w="12240" w:h="15840"/>
-      <w:pgMar w:top="792" w:right="936" w:bottom="792" w:left="936" w:header="720" w:footer="720" w:gutter="0"/>
+      <w:pgMar w:top="936" w:right="1008" w:bottom="936" w:left="1008" w:header="720" w:footer="720" w:gutter="0"/>
       <w:cols w:space="720"/>
       <w:docGrid w:linePitch="360"/>
     </w:sectPr>
@@ -1446,7 +4788,7 @@
     <w:qFormat/>
     <w:rsid w:val="00FC693F"/>
     <w:rPr>
-      <w:rFonts w:ascii="Arial" w:hAnsi="Arial"/>
+      <w:rFonts w:ascii="Aptos" w:hAnsi="Aptos" w:eastAsia="Aptos"/>
       <w:sz w:val="20"/>
     </w:rPr>
   </w:style>
@@ -1509,11 +4851,11 @@
       <w:outlineLvl w:val="0"/>
     </w:pPr>
     <w:rPr>
-      <w:rFonts w:asciiTheme="majorHAnsi" w:eastAsiaTheme="majorEastAsia" w:hAnsiTheme="majorHAnsi" w:cstheme="majorBidi" w:ascii="Arial" w:hAnsi="Arial"/>
+      <w:rFonts w:asciiTheme="majorHAnsi" w:eastAsiaTheme="majorEastAsia" w:hAnsiTheme="majorHAnsi" w:cstheme="majorBidi" w:ascii="Aptos Display" w:hAnsi="Aptos Display" w:eastAsia="Aptos Display"/>
       <w:b/>
       <w:bCs/>
-      <w:color w:val="17365D"/>
-      <w:sz w:val="28"/>
+      <w:color w:val="1F4E79"/>
+      <w:sz w:val="36"/>
       <w:szCs w:val="28"/>
     </w:rPr>
   </w:style>
@@ -1533,11 +4875,11 @@
       <w:outlineLvl w:val="1"/>
     </w:pPr>
     <w:rPr>
-      <w:rFonts w:asciiTheme="majorHAnsi" w:eastAsiaTheme="majorEastAsia" w:hAnsiTheme="majorHAnsi" w:cstheme="majorBidi" w:ascii="Arial" w:hAnsi="Arial"/>
+      <w:rFonts w:asciiTheme="majorHAnsi" w:eastAsiaTheme="majorEastAsia" w:hAnsiTheme="majorHAnsi" w:cstheme="majorBidi" w:ascii="Aptos Display" w:hAnsi="Aptos Display" w:eastAsia="Aptos Display"/>
       <w:b/>
       <w:bCs/>
       <w:color w:val="1F4E79"/>
-      <w:sz w:val="26"/>
+      <w:sz w:val="28"/>
       <w:szCs w:val="26"/>
     </w:rPr>
   </w:style>
@@ -1557,10 +4899,11 @@
       <w:outlineLvl w:val="2"/>
     </w:pPr>
     <w:rPr>
-      <w:rFonts w:asciiTheme="majorHAnsi" w:eastAsiaTheme="majorEastAsia" w:hAnsiTheme="majorHAnsi" w:cstheme="majorBidi" w:ascii="Arial" w:hAnsi="Arial"/>
+      <w:rFonts w:asciiTheme="majorHAnsi" w:eastAsiaTheme="majorEastAsia" w:hAnsiTheme="majorHAnsi" w:cstheme="majorBidi" w:ascii="Aptos Display" w:hAnsi="Aptos Display" w:eastAsia="Aptos Display"/>
       <w:b/>
       <w:bCs/>
-      <w:color w:val="4F81BD" w:themeColor="accent1"/>
+      <w:color w:val="1F4E79"/>
+      <w:sz w:val="24"/>
     </w:rPr>
   </w:style>
   <w:style w:type="paragraph" w:styleId="Heading4">

</xml_diff>